<commit_message>
Finalize Universal Network Theory release candidate
</commit_message>
<xml_diff>
--- a/publication/zenodo_reproduction_v001/UNIVERSAL_NETWORK_THEORY_MAJOR_PROOF_INDEX.docx
+++ b/publication/zenodo_reproduction_v001/UNIVERSAL_NETWORK_THEORY_MAJOR_PROOF_INDEX.docx
@@ -13656,7 +13656,28 @@
           <w:color w:val="1F252B"/>
           <w:sz w:val="21"/>
         </w:rPr>
-        <w:t>Git contains the complete chronological research record: source code, theorem development, authenticated evidence, audits, corrections, superseded routes, and release history.</w:t>
+        <w:t xml:space="preserve">Git contains the complete chronological research record: source code, theorem development, authenticated evidence, audits, corrections, superseded routes, and release history. The public repository is </w:t>
+      </w:r>
+      <w:hyperlink r:id="rId59" w:history="1">
+        <w:r>
+          <w:rPr>
+            <w:color w:val="1D5D88"/>
+            <w:u w:val="single"/>
+            <w:rFonts w:ascii="Aptos" w:hAnsi="Aptos" w:eastAsia="Aptos"/>
+            <w:sz w:val="21"/>
+          </w:rPr>
+          <w:t>gravacle/universal-network-theory</w:t>
+        </w:r>
+      </w:hyperlink>
+      <w:r>
+        <w:rPr>
+          <w:rFonts w:ascii="Aptos" w:hAnsi="Aptos" w:eastAsia="Aptos"/>
+          <w:b w:val="0"/>
+          <w:i w:val="0"/>
+          <w:color w:val="1F252B"/>
+          <w:sz w:val="21"/>
+        </w:rPr>
+        <w:t>.</w:t>
       </w:r>
     </w:p>
     <w:p>
@@ -13875,7 +13896,7 @@
         </w:rPr>
         <w:t xml:space="preserve">The current run is recorded in </w:t>
       </w:r>
-      <w:hyperlink r:id="rId59" w:history="1">
+      <w:hyperlink r:id="rId60" w:history="1">
         <w:r>
           <w:rPr>
             <w:color w:val="1D5D88"/>
@@ -15603,7 +15624,7 @@
         </w:rPr>
         <w:t xml:space="preserve">, 166--176 (2023), </w:t>
       </w:r>
-      <w:hyperlink r:id="rId60" w:history="1">
+      <w:hyperlink r:id="rId61" w:history="1">
         <w:r>
           <w:rPr>
             <w:color w:val="1D5D88"/>
@@ -15688,7 +15709,7 @@
         </w:rPr>
         <w:t xml:space="preserve">, 4423--4439 (1999), </w:t>
       </w:r>
-      <w:hyperlink r:id="rId61" w:history="1">
+      <w:hyperlink r:id="rId62" w:history="1">
         <w:r>
           <w:rPr>
             <w:color w:val="1D5D88"/>
@@ -15837,7 +15858,7 @@
         </w:rPr>
         <w:t xml:space="preserve">, 562--572 (1949), </w:t>
       </w:r>
-      <w:hyperlink r:id="rId62" w:history="1">
+      <w:hyperlink r:id="rId63" w:history="1">
         <w:r>
           <w:rPr>
             <w:color w:val="1D5D88"/>
@@ -15922,7 +15943,7 @@
         </w:rPr>
         <w:t xml:space="preserve">, 6413--6418 (1994), </w:t>
       </w:r>
-      <w:hyperlink r:id="rId63" w:history="1">
+      <w:hyperlink r:id="rId64" w:history="1">
         <w:r>
           <w:rPr>
             <w:color w:val="1D5D88"/>
@@ -16007,7 +16028,7 @@
         </w:rPr>
         <w:t xml:space="preserve">, 978--983 (1997), </w:t>
       </w:r>
-      <w:hyperlink r:id="rId64" w:history="1">
+      <w:hyperlink r:id="rId65" w:history="1">
         <w:r>
           <w:rPr>
             <w:color w:val="1D5D88"/>
@@ -16092,7 +16113,7 @@
         </w:rPr>
         <w:t xml:space="preserve">, 5478--5480 (1994), </w:t>
       </w:r>
-      <w:hyperlink r:id="rId65" w:history="1">
+      <w:hyperlink r:id="rId66" w:history="1">
         <w:r>
           <w:rPr>
             <w:color w:val="1D5D88"/>
@@ -16177,7 +16198,7 @@
         </w:rPr>
         <w:t xml:space="preserve">, 065303 (2009), </w:t>
       </w:r>
-      <w:hyperlink r:id="rId66" w:history="1">
+      <w:hyperlink r:id="rId67" w:history="1">
         <w:r>
           <w:rPr>
             <w:color w:val="1D5D88"/>
@@ -16198,7 +16219,7 @@
         </w:rPr>
         <w:t xml:space="preserve">, </w:t>
       </w:r>
-      <w:hyperlink r:id="rId67" w:history="1">
+      <w:hyperlink r:id="rId68" w:history="1">
         <w:r>
           <w:rPr>
             <w:color w:val="1D5D88"/>
@@ -16283,7 +16304,7 @@
         </w:rPr>
         <w:t xml:space="preserve">, 91--110 (1974), </w:t>
       </w:r>
-      <w:hyperlink r:id="rId68" w:history="1">
+      <w:hyperlink r:id="rId69" w:history="1">
         <w:r>
           <w:rPr>
             <w:color w:val="1D5D88"/>
@@ -16368,7 +16389,7 @@
         </w:rPr>
         <w:t xml:space="preserve">, 177--183 (1973), </w:t>
       </w:r>
-      <w:hyperlink r:id="rId69" w:history="1">
+      <w:hyperlink r:id="rId70" w:history="1">
         <w:r>
           <w:rPr>
             <w:color w:val="1D5D88"/>
@@ -16453,7 +16474,7 @@
         </w:rPr>
         <w:t xml:space="preserve">, 401--419 (1952), </w:t>
       </w:r>
-      <w:hyperlink r:id="rId70" w:history="1">
+      <w:hyperlink r:id="rId71" w:history="1">
         <w:r>
           <w:rPr>
             <w:color w:val="1D5D88"/>
@@ -16538,7 +16559,7 @@
         </w:rPr>
         <w:t xml:space="preserve">, 248--263 (1907), </w:t>
       </w:r>
-      <w:hyperlink r:id="rId71" w:history="1">
+      <w:hyperlink r:id="rId72" w:history="1">
         <w:r>
           <w:rPr>
             <w:color w:val="1D5D88"/>
@@ -16623,7 +16644,7 @@
         </w:rPr>
         <w:t xml:space="preserve">, 456--477 (1912), </w:t>
       </w:r>
-      <w:hyperlink r:id="rId72" w:history="1">
+      <w:hyperlink r:id="rId73" w:history="1">
         <w:r>
           <w:rPr>
             <w:color w:val="1D5D88"/>
@@ -16708,7 +16729,7 @@
         </w:rPr>
         <w:t xml:space="preserve">, 749--754 (1931), </w:t>
       </w:r>
-      <w:hyperlink r:id="rId73" w:history="1">
+      <w:hyperlink r:id="rId74" w:history="1">
         <w:r>
           <w:rPr>
             <w:color w:val="1D5D88"/>
@@ -16793,7 +16814,7 @@
         </w:rPr>
         <w:t xml:space="preserve">, 211--216 (1955), </w:t>
       </w:r>
-      <w:hyperlink r:id="rId74" w:history="1">
+      <w:hyperlink r:id="rId75" w:history="1">
         <w:r>
           <w:rPr>
             <w:color w:val="1D5D88"/>
@@ -16878,7 +16899,7 @@
         </w:rPr>
         <w:t xml:space="preserve">, 96--115 (1927), </w:t>
       </w:r>
-      <w:hyperlink r:id="rId75" w:history="1">
+      <w:hyperlink r:id="rId76" w:history="1">
         <w:r>
           <w:rPr>
             <w:color w:val="1D5D88"/>
@@ -16963,7 +16984,7 @@
         </w:rPr>
         <w:t xml:space="preserve">, 524--530 (2023), </w:t>
       </w:r>
-      <w:hyperlink r:id="rId76" w:history="1">
+      <w:hyperlink r:id="rId77" w:history="1">
         <w:r>
           <w:rPr>
             <w:color w:val="1D5D88"/>
@@ -17048,7 +17069,7 @@
         </w:rPr>
         <w:t xml:space="preserve">, 1099--1107 (2013), </w:t>
       </w:r>
-      <w:hyperlink r:id="rId77" w:history="1">
+      <w:hyperlink r:id="rId78" w:history="1">
         <w:r>
           <w:rPr>
             <w:color w:val="1D5D88"/>
@@ -17113,7 +17134,7 @@
         </w:rPr>
         <w:t xml:space="preserve">, JESD218B.01 (2016), </w:t>
       </w:r>
-      <w:hyperlink r:id="rId78" w:history="1">
+      <w:hyperlink r:id="rId79" w:history="1">
         <w:r>
           <w:rPr>
             <w:color w:val="1D5D88"/>
@@ -17198,7 +17219,7 @@
         </w:rPr>
         <w:t xml:space="preserve">, 181--188 (2009), </w:t>
       </w:r>
-      <w:hyperlink r:id="rId79" w:history="1">
+      <w:hyperlink r:id="rId80" w:history="1">
         <w:r>
           <w:rPr>
             <w:color w:val="1D5D88"/>
@@ -17283,7 +17304,7 @@
         </w:rPr>
         <w:t xml:space="preserve">, 3345--3382 (1993), </w:t>
       </w:r>
-      <w:hyperlink r:id="rId80" w:history="1">
+      <w:hyperlink r:id="rId81" w:history="1">
         <w:r>
           <w:rPr>
             <w:color w:val="1D5D88"/>
@@ -17368,7 +17389,7 @@
         </w:rPr>
         <w:t xml:space="preserve">, 715--775 (2003), </w:t>
       </w:r>
-      <w:hyperlink r:id="rId81" w:history="1">
+      <w:hyperlink r:id="rId82" w:history="1">
         <w:r>
           <w:rPr>
             <w:color w:val="1D5D88"/>
@@ -17453,7 +17474,7 @@
         </w:rPr>
         <w:t xml:space="preserve">, 043029 (2009), </w:t>
       </w:r>
-      <w:hyperlink r:id="rId82" w:history="1">
+      <w:hyperlink r:id="rId83" w:history="1">
         <w:r>
           <w:rPr>
             <w:color w:val="1D5D88"/>
@@ -17538,7 +17559,7 @@
         </w:rPr>
         <w:t xml:space="preserve">, 900--911 (1997), </w:t>
       </w:r>
-      <w:hyperlink r:id="rId83" w:history="1">
+      <w:hyperlink r:id="rId84" w:history="1">
         <w:r>
           <w:rPr>
             <w:color w:val="1D5D88"/>
@@ -17623,7 +17644,7 @@
         </w:rPr>
         <w:t xml:space="preserve">, 2--30 (2003), </w:t>
       </w:r>
-      <w:hyperlink r:id="rId84" w:history="1">
+      <w:hyperlink r:id="rId85" w:history="1">
         <w:r>
           <w:rPr>
             <w:color w:val="1D5D88"/>
@@ -17642,9 +17663,9 @@
           <w:color w:val="1F252B"/>
           <w:sz w:val="21"/>
         </w:rPr>
-        <w:t xml:space="preserve">00018-0), </w:t>
-      </w:r>
-      <w:hyperlink r:id="rId85" w:history="1">
+        <w:t xml:space="preserve">, </w:t>
+      </w:r>
+      <w:hyperlink r:id="rId86" w:history="1">
         <w:r>
           <w:rPr>
             <w:color w:val="1D5D88"/>
@@ -17729,7 +17750,7 @@
         </w:rPr>
         <w:t xml:space="preserve">, 266--271 (1999), </w:t>
       </w:r>
-      <w:hyperlink r:id="rId86" w:history="1">
+      <w:hyperlink r:id="rId87" w:history="1">
         <w:r>
           <w:rPr>
             <w:color w:val="1D5D88"/>
@@ -17750,7 +17771,7 @@
         </w:rPr>
         <w:t xml:space="preserve">, </w:t>
       </w:r>
-      <w:hyperlink r:id="rId87" w:history="1">
+      <w:hyperlink r:id="rId88" w:history="1">
         <w:r>
           <w:rPr>
             <w:color w:val="1D5D88"/>
@@ -17795,7 +17816,7 @@
         </w:rPr>
         <w:t xml:space="preserve">D. Fattal, T. S. Cubitt, Y. Yamamoto, S. Bravyi, and I. L. Chuang, “Entanglement in the Stabilizer Formalism,” </w:t>
       </w:r>
-      <w:hyperlink r:id="rId88" w:history="1">
+      <w:hyperlink r:id="rId89" w:history="1">
         <w:r>
           <w:rPr>
             <w:color w:val="1D5D88"/>
@@ -17880,7 +17901,7 @@
         </w:rPr>
         <w:t xml:space="preserve">, 110404 (2006), </w:t>
       </w:r>
-      <w:hyperlink r:id="rId89" w:history="1">
+      <w:hyperlink r:id="rId90" w:history="1">
         <w:r>
           <w:rPr>
             <w:color w:val="1D5D88"/>
@@ -17965,7 +17986,7 @@
         </w:rPr>
         <w:t xml:space="preserve">, 110405 (2006), </w:t>
       </w:r>
-      <w:hyperlink r:id="rId90" w:history="1">
+      <w:hyperlink r:id="rId91" w:history="1">
         <w:r>
           <w:rPr>
             <w:color w:val="1D5D88"/>
@@ -18010,7 +18031,7 @@
         </w:rPr>
         <w:t xml:space="preserve">S. B. Bravyi and A. Yu. Kitaev, “Quantum Codes on a Lattice with Boundary,” </w:t>
       </w:r>
-      <w:hyperlink r:id="rId91" w:history="1">
+      <w:hyperlink r:id="rId92" w:history="1">
         <w:r>
           <w:rPr>
             <w:color w:val="1D5D88"/>
@@ -18095,7 +18116,7 @@
         </w:rPr>
         <w:t xml:space="preserve">, 2259--2272 (1971), </w:t>
       </w:r>
-      <w:hyperlink r:id="rId92" w:history="1">
+      <w:hyperlink r:id="rId93" w:history="1">
         <w:r>
           <w:rPr>
             <w:color w:val="1D5D88"/>
@@ -18180,7 +18201,7 @@
         </w:rPr>
         <w:t xml:space="preserve">, 2445--2459 (1974), </w:t>
       </w:r>
-      <w:hyperlink r:id="rId93" w:history="1">
+      <w:hyperlink r:id="rId94" w:history="1">
         <w:r>
           <w:rPr>
             <w:color w:val="1D5D88"/>
@@ -18265,7 +18286,7 @@
         </w:rPr>
         <w:t xml:space="preserve">, 174--181 (1976), </w:t>
       </w:r>
-      <w:hyperlink r:id="rId94" w:history="1">
+      <w:hyperlink r:id="rId95" w:history="1">
         <w:r>
           <w:rPr>
             <w:color w:val="1D5D88"/>
@@ -18350,7 +18371,7 @@
         </w:rPr>
         <w:t xml:space="preserve">, 1399--1404 (1977), </w:t>
       </w:r>
-      <w:hyperlink r:id="rId95" w:history="1">
+      <w:hyperlink r:id="rId96" w:history="1">
         <w:r>
           <w:rPr>
             <w:color w:val="1D5D88"/>
@@ -18435,7 +18456,7 @@
         </w:rPr>
         <w:t xml:space="preserve">, 498--501 (1971), </w:t>
       </w:r>
-      <w:hyperlink r:id="rId96" w:history="1">
+      <w:hyperlink r:id="rId97" w:history="1">
         <w:r>
           <w:rPr>
             <w:color w:val="1D5D88"/>
@@ -18520,7 +18541,7 @@
         </w:rPr>
         <w:t xml:space="preserve">, 054517 (2011), </w:t>
       </w:r>
-      <w:hyperlink r:id="rId97" w:history="1">
+      <w:hyperlink r:id="rId98" w:history="1">
         <w:r>
           <w:rPr>
             <w:color w:val="1D5D88"/>
@@ -18541,7 +18562,7 @@
         </w:rPr>
         <w:t xml:space="preserve">, </w:t>
       </w:r>
-      <w:hyperlink r:id="rId98" w:history="1">
+      <w:hyperlink r:id="rId99" w:history="1">
         <w:r>
           <w:rPr>
             <w:color w:val="1D5D88"/>
@@ -18626,7 +18647,7 @@
         </w:rPr>
         <w:t xml:space="preserve">, 245101 (2011), </w:t>
       </w:r>
-      <w:hyperlink r:id="rId99" w:history="1">
+      <w:hyperlink r:id="rId100" w:history="1">
         <w:r>
           <w:rPr>
             <w:color w:val="1D5D88"/>
@@ -18647,7 +18668,7 @@
         </w:rPr>
         <w:t xml:space="preserve">, </w:t>
       </w:r>
-      <w:hyperlink r:id="rId100" w:history="1">
+      <w:hyperlink r:id="rId101" w:history="1">
         <w:r>
           <w:rPr>
             <w:color w:val="1D5D88"/>
@@ -18732,7 +18753,7 @@
         </w:rPr>
         <w:t xml:space="preserve">, 033105 (2025), </w:t>
       </w:r>
-      <w:hyperlink r:id="rId101" w:history="1">
+      <w:hyperlink r:id="rId102" w:history="1">
         <w:r>
           <w:rPr>
             <w:color w:val="1D5D88"/>

</xml_diff>

<commit_message>
Finalize Zenodo DOI release metadata
</commit_message>
<xml_diff>
--- a/publication/zenodo_reproduction_v001/UNIVERSAL_NETWORK_THEORY_MAJOR_PROOF_INDEX.docx
+++ b/publication/zenodo_reproduction_v001/UNIVERSAL_NETWORK_THEORY_MAJOR_PROOF_INDEX.docx
@@ -34,7 +34,7 @@
           <w:color w:val="1F252B"/>
           <w:sz w:val="21"/>
         </w:rPr>
-        <w:t xml:space="preserve"> V001 preparation</w:t>
+        <w:t xml:space="preserve"> V001 release</w:t>
       </w:r>
     </w:p>
     <w:p>
@@ -49,17 +49,17 @@
           <w:color w:val="1F252B"/>
           <w:sz w:val="21"/>
         </w:rPr>
-        <w:t>Prepared:</w:t>
-      </w:r>
-      <w:r>
-        <w:rPr>
-          <w:rFonts w:ascii="Aptos" w:hAnsi="Aptos" w:eastAsia="Aptos"/>
-          <w:b w:val="0"/>
-          <w:i w:val="0"/>
-          <w:color w:val="1F252B"/>
-          <w:sz w:val="21"/>
-        </w:rPr>
-        <w:t xml:space="preserve"> 2026-09-19</w:t>
+        <w:t>Release:</w:t>
+      </w:r>
+      <w:r>
+        <w:rPr>
+          <w:rFonts w:ascii="Aptos" w:hAnsi="Aptos" w:eastAsia="Aptos"/>
+          <w:b w:val="0"/>
+          <w:i w:val="0"/>
+          <w:color w:val="1F252B"/>
+          <w:sz w:val="21"/>
+        </w:rPr>
+        <w:t xml:space="preserve"> v1.0.0</w:t>
       </w:r>
     </w:p>
     <w:p>
@@ -69,13 +69,34 @@
       <w:r>
         <w:rPr>
           <w:rFonts w:ascii="Aptos" w:hAnsi="Aptos" w:eastAsia="Aptos"/>
-          <w:b w:val="0"/>
-          <w:i w:val="0"/>
-          <w:color w:val="1F252B"/>
-          <w:sz w:val="21"/>
-        </w:rPr>
-        <w:t>Universal Network Theory (UNT) fundamentally redefines the structure of physical reality, resolving the historic incompatibility between quantum mechanics and general relativity by eliminating the spacetime continuum entirely. Space and time are no longer treated as a smooth, pre-existing background, nor is quantum measurement treated as a probabilistic wave collapse triggered by an observer. Instead, UNT establishes that the universe is a discrete, computable topological framework. Physical reality is built entirely from immutable structural records, and gravity emerges not as a fundamental force across a void, but as the exact macroscopic thermodynamic response of the network processing those transactions.</w:t>
-      </w:r>
+          <w:b/>
+          <w:i w:val="0"/>
+          <w:color w:val="1F252B"/>
+          <w:sz w:val="21"/>
+        </w:rPr>
+        <w:t>DOI:</w:t>
+      </w:r>
+      <w:r>
+        <w:rPr>
+          <w:rFonts w:ascii="Aptos" w:hAnsi="Aptos" w:eastAsia="Aptos"/>
+          <w:b w:val="0"/>
+          <w:i w:val="0"/>
+          <w:color w:val="1F252B"/>
+          <w:sz w:val="21"/>
+        </w:rPr>
+        <w:t xml:space="preserve"> </w:t>
+      </w:r>
+      <w:hyperlink r:id="rId11" w:history="1">
+        <w:r>
+          <w:rPr>
+            <w:color w:val="1D5D88"/>
+            <w:u w:val="single"/>
+            <w:rFonts w:ascii="Aptos" w:hAnsi="Aptos" w:eastAsia="Aptos"/>
+            <w:sz w:val="21"/>
+          </w:rPr>
+          <w:t>10.5281/zenodo.22859377</w:t>
+        </w:r>
+      </w:hyperlink>
     </w:p>
     <w:p>
       <w:pPr>
@@ -84,12 +105,22 @@
       <w:r>
         <w:rPr>
           <w:rFonts w:ascii="Aptos" w:hAnsi="Aptos" w:eastAsia="Aptos"/>
-          <w:b w:val="0"/>
-          <w:i w:val="0"/>
-          <w:color w:val="1F252B"/>
-          <w:sz w:val="21"/>
-        </w:rPr>
-        <w:t>By structurally unifying quantum-scale record formation and macroscopic gravity, the declared working theory establishes four definitive physical conclusions:</w:t>
+          <w:b/>
+          <w:i w:val="0"/>
+          <w:color w:val="1F252B"/>
+          <w:sz w:val="21"/>
+        </w:rPr>
+        <w:t>Prepared:</w:t>
+      </w:r>
+      <w:r>
+        <w:rPr>
+          <w:rFonts w:ascii="Aptos" w:hAnsi="Aptos" w:eastAsia="Aptos"/>
+          <w:b w:val="0"/>
+          <w:i w:val="0"/>
+          <w:color w:val="1F252B"/>
+          <w:sz w:val="21"/>
+        </w:rPr>
+        <w:t xml:space="preserve"> 2026-09-19</w:t>
       </w:r>
     </w:p>
     <w:p>
@@ -99,43 +130,12 @@
       <w:r>
         <w:rPr>
           <w:rFonts w:ascii="Aptos" w:hAnsi="Aptos" w:eastAsia="Aptos"/>
-          <w:b/>
-          <w:i w:val="0"/>
-          <w:color w:val="1F252B"/>
-          <w:sz w:val="21"/>
-        </w:rPr>
-        <w:t>The Microscopic Mechanism:</w:t>
-      </w:r>
-      <w:r>
-        <w:rPr>
-          <w:rFonts w:ascii="Aptos" w:hAnsi="Aptos" w:eastAsia="Aptos"/>
-          <w:b w:val="0"/>
-          <w:i w:val="0"/>
-          <w:color w:val="1F252B"/>
-          <w:sz w:val="21"/>
-        </w:rPr>
-        <w:t xml:space="preserve"> Discrete causal records are constructed through the ordered sequence </w:t>
-      </w:r>
-      <w:r>
-        <w:rPr>
-          <w:rFonts w:ascii="Aptos Mono" w:hAnsi="Aptos Mono" w:eastAsia="Aptos Mono"/>
-          <w:b w:val="0"/>
-          <w:i w:val="0"/>
-          <w:color w:val="1F252B"/>
-          <w:sz w:val="19"/>
-          <w:shd w:fill="F1F3F5"/>
-        </w:rPr>
-        <w:t>ALLOW -&gt; REQUIRE -&gt; GATE -&gt; ELECTROMAGNETISM -&gt; RECORD</w:t>
-      </w:r>
-      <w:r>
-        <w:rPr>
-          <w:rFonts w:ascii="Aptos" w:hAnsi="Aptos" w:eastAsia="Aptos"/>
-          <w:b w:val="0"/>
-          <w:i w:val="0"/>
-          <w:color w:val="1F252B"/>
-          <w:sz w:val="21"/>
-        </w:rPr>
-        <w:t>.</w:t>
+          <w:b w:val="0"/>
+          <w:i w:val="0"/>
+          <w:color w:val="1F252B"/>
+          <w:sz w:val="21"/>
+        </w:rPr>
+        <w:t>Universal Network Theory (UNT) fundamentally redefines the structure of physical reality, resolving the historic incompatibility between quantum mechanics and general relativity by eliminating the spacetime continuum entirely. Space and time are no longer treated as a smooth, pre-existing background, nor is quantum measurement treated as a probabilistic wave collapse triggered by an observer. Instead, UNT establishes that the universe is a discrete, computable topological framework. Physical reality is built entirely from immutable structural records, and gravity emerges not as a fundamental force across a void, but as the exact macroscopic thermodynamic response of the network processing those transactions.</w:t>
       </w:r>
     </w:p>
     <w:p>
@@ -145,22 +145,12 @@
       <w:r>
         <w:rPr>
           <w:rFonts w:ascii="Aptos" w:hAnsi="Aptos" w:eastAsia="Aptos"/>
-          <w:b/>
-          <w:i w:val="0"/>
-          <w:color w:val="1F252B"/>
-          <w:sz w:val="21"/>
-        </w:rPr>
-        <w:t>The Alpha Requirement:</w:t>
-      </w:r>
-      <w:r>
-        <w:rPr>
-          <w:rFonts w:ascii="Aptos" w:hAnsi="Aptos" w:eastAsia="Aptos"/>
-          <w:b w:val="0"/>
-          <w:i w:val="0"/>
-          <w:color w:val="1F252B"/>
-          <w:sz w:val="21"/>
-        </w:rPr>
-        <w:t xml:space="preserve"> The sequence strictly enforces the measured fine-structure constant (α) and its scaling trajectory for every record.</w:t>
+          <w:b w:val="0"/>
+          <w:i w:val="0"/>
+          <w:color w:val="1F252B"/>
+          <w:sz w:val="21"/>
+        </w:rPr>
+        <w:t>By structurally unifying quantum-scale record formation and macroscopic gravity, the declared working theory establishes four definitive physical conclusions:</w:t>
       </w:r>
     </w:p>
     <w:p>
@@ -175,17 +165,38 @@
           <w:color w:val="1F252B"/>
           <w:sz w:val="21"/>
         </w:rPr>
-        <w:t>The Structural Foundation of Gravity:</w:t>
-      </w:r>
-      <w:r>
-        <w:rPr>
-          <w:rFonts w:ascii="Aptos" w:hAnsi="Aptos" w:eastAsia="Aptos"/>
-          <w:b w:val="0"/>
-          <w:i w:val="0"/>
-          <w:color w:val="1F252B"/>
-          <w:sz w:val="21"/>
-        </w:rPr>
-        <w:t xml:space="preserve"> By evaluating this finite microscopic domain and establishing its dynamical exponent, Gravity Formation Theory proves this discrete network supplies the exact microscopic foundation required for gravity.</w:t>
+        <w:t>The Microscopic Mechanism:</w:t>
+      </w:r>
+      <w:r>
+        <w:rPr>
+          <w:rFonts w:ascii="Aptos" w:hAnsi="Aptos" w:eastAsia="Aptos"/>
+          <w:b w:val="0"/>
+          <w:i w:val="0"/>
+          <w:color w:val="1F252B"/>
+          <w:sz w:val="21"/>
+        </w:rPr>
+        <w:t xml:space="preserve"> Discrete causal records are constructed through the ordered sequence </w:t>
+      </w:r>
+      <w:r>
+        <w:rPr>
+          <w:rFonts w:ascii="Aptos Mono" w:hAnsi="Aptos Mono" w:eastAsia="Aptos Mono"/>
+          <w:b w:val="0"/>
+          <w:i w:val="0"/>
+          <w:color w:val="1F252B"/>
+          <w:sz w:val="19"/>
+          <w:shd w:fill="F1F3F5"/>
+        </w:rPr>
+        <w:t>ALLOW -&gt; REQUIRE -&gt; GATE -&gt; ELECTROMAGNETISM -&gt; RECORD</w:t>
+      </w:r>
+      <w:r>
+        <w:rPr>
+          <w:rFonts w:ascii="Aptos" w:hAnsi="Aptos" w:eastAsia="Aptos"/>
+          <w:b w:val="0"/>
+          <w:i w:val="0"/>
+          <w:color w:val="1F252B"/>
+          <w:sz w:val="21"/>
+        </w:rPr>
+        <w:t>.</w:t>
       </w:r>
     </w:p>
     <w:p>
@@ -200,17 +211,17 @@
           <w:color w:val="1F252B"/>
           <w:sz w:val="21"/>
         </w:rPr>
-        <w:t>The Macroscopic Derivation:</w:t>
-      </w:r>
-      <w:r>
-        <w:rPr>
-          <w:rFonts w:ascii="Aptos" w:hAnsi="Aptos" w:eastAsia="Aptos"/>
-          <w:b w:val="0"/>
-          <w:i w:val="0"/>
-          <w:color w:val="1F252B"/>
-          <w:sz w:val="21"/>
-        </w:rPr>
-        <w:t xml:space="preserve"> From this discrete foundation, and under stated continuum premises, the exact conditional macroscopic gravitational response is mathematically derived.</w:t>
+        <w:t>The Alpha Requirement:</w:t>
+      </w:r>
+      <w:r>
+        <w:rPr>
+          <w:rFonts w:ascii="Aptos" w:hAnsi="Aptos" w:eastAsia="Aptos"/>
+          <w:b w:val="0"/>
+          <w:i w:val="0"/>
+          <w:color w:val="1F252B"/>
+          <w:sz w:val="21"/>
+        </w:rPr>
+        <w:t xml:space="preserve"> The sequence strictly enforces the measured fine-structure constant (α) and its scaling trajectory for every record.</w:t>
       </w:r>
     </w:p>
     <w:p>
@@ -220,12 +231,22 @@
       <w:r>
         <w:rPr>
           <w:rFonts w:ascii="Aptos" w:hAnsi="Aptos" w:eastAsia="Aptos"/>
-          <w:b w:val="0"/>
-          <w:i w:val="0"/>
-          <w:color w:val="1F252B"/>
-          <w:sz w:val="21"/>
-        </w:rPr>
-        <w:t>Thus, gravity is proved to be the self-consistent macroscopic response of record-conditioned geometry, built entirely from auditable quantum premises.</w:t>
+          <w:b/>
+          <w:i w:val="0"/>
+          <w:color w:val="1F252B"/>
+          <w:sz w:val="21"/>
+        </w:rPr>
+        <w:t>The Structural Foundation of Gravity:</w:t>
+      </w:r>
+      <w:r>
+        <w:rPr>
+          <w:rFonts w:ascii="Aptos" w:hAnsi="Aptos" w:eastAsia="Aptos"/>
+          <w:b w:val="0"/>
+          <w:i w:val="0"/>
+          <w:color w:val="1F252B"/>
+          <w:sz w:val="21"/>
+        </w:rPr>
+        <w:t xml:space="preserve"> By evaluating this finite microscopic domain and establishing its dynamical exponent, Gravity Formation Theory proves this discrete network supplies the exact microscopic foundation required for gravity.</w:t>
       </w:r>
     </w:p>
     <w:p>
@@ -240,7 +261,17 @@
           <w:color w:val="1F252B"/>
           <w:sz w:val="21"/>
         </w:rPr>
-        <w:t>The Proof Ledger</w:t>
+        <w:t>The Macroscopic Derivation:</w:t>
+      </w:r>
+      <w:r>
+        <w:rPr>
+          <w:rFonts w:ascii="Aptos" w:hAnsi="Aptos" w:eastAsia="Aptos"/>
+          <w:b w:val="0"/>
+          <w:i w:val="0"/>
+          <w:color w:val="1F252B"/>
+          <w:sz w:val="21"/>
+        </w:rPr>
+        <w:t xml:space="preserve"> From this discrete foundation, and under stated continuum premises, the exact conditional macroscopic gravitational response is mathematically derived.</w:t>
       </w:r>
     </w:p>
     <w:p>
@@ -255,7 +286,7 @@
           <w:color w:val="1F252B"/>
           <w:sz w:val="21"/>
         </w:rPr>
-        <w:t>This index serves as the authoritative structural ledger for that unification. It exposes the exact mathematical theorems, the numerically authenticated computational evidence, and the immutable cryptographic custody required to execute a hostile independent audit of the theory.</w:t>
+        <w:t>Thus, gravity is proved to be the self-consistent macroscopic response of record-conditioned geometry, built entirely from auditable quantum premises.</w:t>
       </w:r>
     </w:p>
     <w:p>
@@ -265,222 +296,12 @@
       <w:r>
         <w:rPr>
           <w:rFonts w:ascii="Aptos" w:hAnsi="Aptos" w:eastAsia="Aptos"/>
-          <w:b w:val="0"/>
-          <w:i w:val="0"/>
-          <w:color w:val="1F252B"/>
-          <w:sz w:val="21"/>
-        </w:rPr>
-        <w:t xml:space="preserve">The principal release conclusion is finite and precise. The authenticated </w:t>
-      </w:r>
-      <w:r>
-        <w:rPr>
-          <w:rFonts w:ascii="Aptos Mono" w:hAnsi="Aptos Mono" w:eastAsia="Aptos Mono"/>
-          <w:b w:val="0"/>
-          <w:i w:val="0"/>
-          <w:color w:val="1F252B"/>
-          <w:sz w:val="19"/>
-          <w:shd w:fill="F1F3F5"/>
-        </w:rPr>
-        <w:t>A009--A016</w:t>
-      </w:r>
-      <w:r>
-        <w:rPr>
-          <w:rFonts w:ascii="Aptos" w:hAnsi="Aptos" w:eastAsia="Aptos"/>
-          <w:b w:val="0"/>
-          <w:i w:val="0"/>
-          <w:color w:val="1F252B"/>
-          <w:sz w:val="21"/>
-        </w:rPr>
-        <w:t xml:space="preserve"> domain has exact bounded record membership at </w:t>
-      </w:r>
-      <w:r>
-        <w:rPr>
-          <w:rFonts w:ascii="Aptos Mono" w:hAnsi="Aptos Mono" w:eastAsia="Aptos Mono"/>
-          <w:b w:val="0"/>
-          <w:i w:val="0"/>
-          <w:color w:val="1F252B"/>
-          <w:sz w:val="19"/>
-          <w:shd w:fill="F1F3F5"/>
-        </w:rPr>
-        <w:t>L=4</w:t>
-      </w:r>
-      <w:r>
-        <w:rPr>
-          <w:rFonts w:ascii="Aptos" w:hAnsi="Aptos" w:eastAsia="Aptos"/>
-          <w:b w:val="0"/>
-          <w:i w:val="0"/>
-          <w:color w:val="1F252B"/>
-          <w:sz w:val="21"/>
-        </w:rPr>
-        <w:t xml:space="preserve">, </w:t>
-      </w:r>
-      <w:r>
-        <w:rPr>
-          <w:rFonts w:ascii="Aptos Mono" w:hAnsi="Aptos Mono" w:eastAsia="Aptos Mono"/>
-          <w:b w:val="0"/>
-          <w:i w:val="0"/>
-          <w:color w:val="1F252B"/>
-          <w:sz w:val="19"/>
-          <w:shd w:fill="F1F3F5"/>
-        </w:rPr>
-        <w:t>L=6</w:t>
-      </w:r>
-      <w:r>
-        <w:rPr>
-          <w:rFonts w:ascii="Aptos" w:hAnsi="Aptos" w:eastAsia="Aptos"/>
-          <w:b w:val="0"/>
-          <w:i w:val="0"/>
-          <w:color w:val="1F252B"/>
-          <w:sz w:val="21"/>
-        </w:rPr>
-        <w:t xml:space="preserve">, </w:t>
-      </w:r>
-      <w:r>
-        <w:rPr>
-          <w:rFonts w:ascii="Aptos Mono" w:hAnsi="Aptos Mono" w:eastAsia="Aptos Mono"/>
-          <w:b w:val="0"/>
-          <w:i w:val="0"/>
-          <w:color w:val="1F252B"/>
-          <w:sz w:val="19"/>
-          <w:shd w:fill="F1F3F5"/>
-        </w:rPr>
-        <w:t>L=8</w:t>
-      </w:r>
-      <w:r>
-        <w:rPr>
-          <w:rFonts w:ascii="Aptos" w:hAnsi="Aptos" w:eastAsia="Aptos"/>
-          <w:b w:val="0"/>
-          <w:i w:val="0"/>
-          <w:color w:val="1F252B"/>
-          <w:sz w:val="21"/>
-        </w:rPr>
-        <w:t xml:space="preserve">, </w:t>
-      </w:r>
-      <w:r>
-        <w:rPr>
-          <w:rFonts w:ascii="Aptos Mono" w:hAnsi="Aptos Mono" w:eastAsia="Aptos Mono"/>
-          <w:b w:val="0"/>
-          <w:i w:val="0"/>
-          <w:color w:val="1F252B"/>
-          <w:sz w:val="19"/>
-          <w:shd w:fill="F1F3F5"/>
-        </w:rPr>
-        <w:t>L=10</w:t>
-      </w:r>
-      <w:r>
-        <w:rPr>
-          <w:rFonts w:ascii="Aptos" w:hAnsi="Aptos" w:eastAsia="Aptos"/>
-          <w:b w:val="0"/>
-          <w:i w:val="0"/>
-          <w:color w:val="1F252B"/>
-          <w:sz w:val="21"/>
-        </w:rPr>
-        <w:t xml:space="preserve">, and </w:t>
-      </w:r>
-      <w:r>
-        <w:rPr>
-          <w:rFonts w:ascii="Aptos Mono" w:hAnsi="Aptos Mono" w:eastAsia="Aptos Mono"/>
-          <w:b w:val="0"/>
-          <w:i w:val="0"/>
-          <w:color w:val="1F252B"/>
-          <w:sz w:val="19"/>
-          <w:shd w:fill="F1F3F5"/>
-        </w:rPr>
-        <w:t>L=12</w:t>
-      </w:r>
-      <w:r>
-        <w:rPr>
-          <w:rFonts w:ascii="Aptos" w:hAnsi="Aptos" w:eastAsia="Aptos"/>
-          <w:b w:val="0"/>
-          <w:i w:val="0"/>
-          <w:color w:val="1F252B"/>
-          <w:sz w:val="21"/>
-        </w:rPr>
-        <w:t xml:space="preserve">; its deduplicated mass exceeds </w:t>
-      </w:r>
-      <w:r>
-        <w:rPr>
-          <w:rFonts w:ascii="Aptos Mono" w:hAnsi="Aptos Mono" w:eastAsia="Aptos Mono"/>
-          <w:b w:val="0"/>
-          <w:i w:val="0"/>
-          <w:color w:val="1F252B"/>
-          <w:sz w:val="19"/>
-          <w:shd w:fill="F1F3F5"/>
-        </w:rPr>
-        <w:t>0.50</w:t>
-      </w:r>
-      <w:r>
-        <w:rPr>
-          <w:rFonts w:ascii="Aptos" w:hAnsi="Aptos" w:eastAsia="Aptos"/>
-          <w:b w:val="0"/>
-          <w:i w:val="0"/>
-          <w:color w:val="1F252B"/>
-          <w:sz w:val="21"/>
-        </w:rPr>
-        <w:t xml:space="preserve"> at every authenticated size; and all 13 unique selected </w:t>
-      </w:r>
-      <w:r>
-        <w:rPr>
-          <w:rFonts w:ascii="Aptos Mono" w:hAnsi="Aptos Mono" w:eastAsia="Aptos Mono"/>
-          <w:b w:val="0"/>
-          <w:i w:val="0"/>
-          <w:color w:val="1F252B"/>
-          <w:sz w:val="19"/>
-          <w:shd w:fill="F1F3F5"/>
-        </w:rPr>
-        <w:t>(L,q)</w:t>
-      </w:r>
-      <w:r>
-        <w:rPr>
-          <w:rFonts w:ascii="Aptos" w:hAnsi="Aptos" w:eastAsia="Aptos"/>
-          <w:b w:val="0"/>
-          <w:i w:val="0"/>
-          <w:color w:val="1F252B"/>
-          <w:sz w:val="21"/>
-        </w:rPr>
-        <w:t xml:space="preserve"> rows have strictly positive finite probe visibility. Under the adopted, project-native finite ARGER Gate, those facts establish the finite Gravity Formation Theory </w:t>
-      </w:r>
-      <w:r>
-        <w:rPr>
-          <w:rFonts w:ascii="Aptos Mono" w:hAnsi="Aptos Mono" w:eastAsia="Aptos Mono"/>
-          <w:b w:val="0"/>
-          <w:i w:val="0"/>
-          <w:color w:val="1F252B"/>
-          <w:sz w:val="19"/>
-          <w:shd w:fill="F1F3F5"/>
-        </w:rPr>
-        <w:t>z=1</w:t>
-      </w:r>
-      <w:r>
-        <w:rPr>
-          <w:rFonts w:ascii="Aptos" w:hAnsi="Aptos" w:eastAsia="Aptos"/>
-          <w:b w:val="0"/>
-          <w:i w:val="0"/>
-          <w:color w:val="1F252B"/>
-          <w:sz w:val="21"/>
-        </w:rPr>
-        <w:t xml:space="preserve"> classification. Here, finite identifies the exact authenticated theorem domain and the complete declared classification. A separate analytic theorem conditionally establishes the standard thermodynamic dynamical exponent </w:t>
-      </w:r>
-      <w:r>
-        <w:rPr>
-          <w:rFonts w:ascii="Aptos Mono" w:hAnsi="Aptos Mono" w:eastAsia="Aptos Mono"/>
-          <w:b w:val="0"/>
-          <w:i w:val="0"/>
-          <w:color w:val="1F252B"/>
-          <w:sz w:val="19"/>
-          <w:shd w:fill="F1F3F5"/>
-        </w:rPr>
-        <w:t>z=1</w:t>
-      </w:r>
-      <w:r>
-        <w:rPr>
-          <w:rFonts w:ascii="Aptos" w:hAnsi="Aptos" w:eastAsia="Aptos"/>
-          <w:b w:val="0"/>
-          <w:i w:val="0"/>
-          <w:color w:val="1F252B"/>
-          <w:sz w:val="21"/>
-        </w:rPr>
-        <w:t xml:space="preserve"> under its named same-model Luttinger-liquid premise (LL-P).</w:t>
+          <w:b/>
+          <w:i w:val="0"/>
+          <w:color w:val="1F252B"/>
+          <w:sz w:val="21"/>
+        </w:rPr>
+        <w:t>The Proof Ledger</w:t>
       </w:r>
     </w:p>
     <w:p>
@@ -490,12 +311,12 @@
       <w:r>
         <w:rPr>
           <w:rFonts w:ascii="Aptos" w:hAnsi="Aptos" w:eastAsia="Aptos"/>
-          <w:b/>
-          <w:i w:val="0"/>
-          <w:color w:val="1F252B"/>
-          <w:sz w:val="21"/>
-        </w:rPr>
-        <w:t>Execution Architecture: An Intelition Project</w:t>
+          <w:b w:val="0"/>
+          <w:i w:val="0"/>
+          <w:color w:val="1F252B"/>
+          <w:sz w:val="21"/>
+        </w:rPr>
+        <w:t>This index serves as the authoritative structural ledger for that unification. It exposes the exact mathematical theorems, the numerically authenticated computational evidence, and the immutable cryptographic custody required to execute a hostile independent audit of the theory.</w:t>
       </w:r>
     </w:p>
     <w:p>
@@ -510,7 +331,217 @@
           <w:color w:val="1F252B"/>
           <w:sz w:val="21"/>
         </w:rPr>
-        <w:t>Universal Network Theory was architected and executed by one human directing a unified ensemble of frontier artificial intelligence (AI) models. The exact mathematical theorems, simulation code, and structural prose indexed in this repository were compiled through continuous, active integration with ChatGPT 5.6 Sol Ultra, Gemini Extended, Claude Opus 5 Ultra, and Grok 4.6.</w:t>
+        <w:t xml:space="preserve">The principal release conclusion is finite and precise. The authenticated </w:t>
+      </w:r>
+      <w:r>
+        <w:rPr>
+          <w:rFonts w:ascii="Aptos Mono" w:hAnsi="Aptos Mono" w:eastAsia="Aptos Mono"/>
+          <w:b w:val="0"/>
+          <w:i w:val="0"/>
+          <w:color w:val="1F252B"/>
+          <w:sz w:val="19"/>
+          <w:shd w:fill="F1F3F5"/>
+        </w:rPr>
+        <w:t>A009--A016</w:t>
+      </w:r>
+      <w:r>
+        <w:rPr>
+          <w:rFonts w:ascii="Aptos" w:hAnsi="Aptos" w:eastAsia="Aptos"/>
+          <w:b w:val="0"/>
+          <w:i w:val="0"/>
+          <w:color w:val="1F252B"/>
+          <w:sz w:val="21"/>
+        </w:rPr>
+        <w:t xml:space="preserve"> domain has exact bounded record membership at </w:t>
+      </w:r>
+      <w:r>
+        <w:rPr>
+          <w:rFonts w:ascii="Aptos Mono" w:hAnsi="Aptos Mono" w:eastAsia="Aptos Mono"/>
+          <w:b w:val="0"/>
+          <w:i w:val="0"/>
+          <w:color w:val="1F252B"/>
+          <w:sz w:val="19"/>
+          <w:shd w:fill="F1F3F5"/>
+        </w:rPr>
+        <w:t>L=4</w:t>
+      </w:r>
+      <w:r>
+        <w:rPr>
+          <w:rFonts w:ascii="Aptos" w:hAnsi="Aptos" w:eastAsia="Aptos"/>
+          <w:b w:val="0"/>
+          <w:i w:val="0"/>
+          <w:color w:val="1F252B"/>
+          <w:sz w:val="21"/>
+        </w:rPr>
+        <w:t xml:space="preserve">, </w:t>
+      </w:r>
+      <w:r>
+        <w:rPr>
+          <w:rFonts w:ascii="Aptos Mono" w:hAnsi="Aptos Mono" w:eastAsia="Aptos Mono"/>
+          <w:b w:val="0"/>
+          <w:i w:val="0"/>
+          <w:color w:val="1F252B"/>
+          <w:sz w:val="19"/>
+          <w:shd w:fill="F1F3F5"/>
+        </w:rPr>
+        <w:t>L=6</w:t>
+      </w:r>
+      <w:r>
+        <w:rPr>
+          <w:rFonts w:ascii="Aptos" w:hAnsi="Aptos" w:eastAsia="Aptos"/>
+          <w:b w:val="0"/>
+          <w:i w:val="0"/>
+          <w:color w:val="1F252B"/>
+          <w:sz w:val="21"/>
+        </w:rPr>
+        <w:t xml:space="preserve">, </w:t>
+      </w:r>
+      <w:r>
+        <w:rPr>
+          <w:rFonts w:ascii="Aptos Mono" w:hAnsi="Aptos Mono" w:eastAsia="Aptos Mono"/>
+          <w:b w:val="0"/>
+          <w:i w:val="0"/>
+          <w:color w:val="1F252B"/>
+          <w:sz w:val="19"/>
+          <w:shd w:fill="F1F3F5"/>
+        </w:rPr>
+        <w:t>L=8</w:t>
+      </w:r>
+      <w:r>
+        <w:rPr>
+          <w:rFonts w:ascii="Aptos" w:hAnsi="Aptos" w:eastAsia="Aptos"/>
+          <w:b w:val="0"/>
+          <w:i w:val="0"/>
+          <w:color w:val="1F252B"/>
+          <w:sz w:val="21"/>
+        </w:rPr>
+        <w:t xml:space="preserve">, </w:t>
+      </w:r>
+      <w:r>
+        <w:rPr>
+          <w:rFonts w:ascii="Aptos Mono" w:hAnsi="Aptos Mono" w:eastAsia="Aptos Mono"/>
+          <w:b w:val="0"/>
+          <w:i w:val="0"/>
+          <w:color w:val="1F252B"/>
+          <w:sz w:val="19"/>
+          <w:shd w:fill="F1F3F5"/>
+        </w:rPr>
+        <w:t>L=10</w:t>
+      </w:r>
+      <w:r>
+        <w:rPr>
+          <w:rFonts w:ascii="Aptos" w:hAnsi="Aptos" w:eastAsia="Aptos"/>
+          <w:b w:val="0"/>
+          <w:i w:val="0"/>
+          <w:color w:val="1F252B"/>
+          <w:sz w:val="21"/>
+        </w:rPr>
+        <w:t xml:space="preserve">, and </w:t>
+      </w:r>
+      <w:r>
+        <w:rPr>
+          <w:rFonts w:ascii="Aptos Mono" w:hAnsi="Aptos Mono" w:eastAsia="Aptos Mono"/>
+          <w:b w:val="0"/>
+          <w:i w:val="0"/>
+          <w:color w:val="1F252B"/>
+          <w:sz w:val="19"/>
+          <w:shd w:fill="F1F3F5"/>
+        </w:rPr>
+        <w:t>L=12</w:t>
+      </w:r>
+      <w:r>
+        <w:rPr>
+          <w:rFonts w:ascii="Aptos" w:hAnsi="Aptos" w:eastAsia="Aptos"/>
+          <w:b w:val="0"/>
+          <w:i w:val="0"/>
+          <w:color w:val="1F252B"/>
+          <w:sz w:val="21"/>
+        </w:rPr>
+        <w:t xml:space="preserve">; its deduplicated mass exceeds </w:t>
+      </w:r>
+      <w:r>
+        <w:rPr>
+          <w:rFonts w:ascii="Aptos Mono" w:hAnsi="Aptos Mono" w:eastAsia="Aptos Mono"/>
+          <w:b w:val="0"/>
+          <w:i w:val="0"/>
+          <w:color w:val="1F252B"/>
+          <w:sz w:val="19"/>
+          <w:shd w:fill="F1F3F5"/>
+        </w:rPr>
+        <w:t>0.50</w:t>
+      </w:r>
+      <w:r>
+        <w:rPr>
+          <w:rFonts w:ascii="Aptos" w:hAnsi="Aptos" w:eastAsia="Aptos"/>
+          <w:b w:val="0"/>
+          <w:i w:val="0"/>
+          <w:color w:val="1F252B"/>
+          <w:sz w:val="21"/>
+        </w:rPr>
+        <w:t xml:space="preserve"> at every authenticated size; and all 13 unique selected </w:t>
+      </w:r>
+      <w:r>
+        <w:rPr>
+          <w:rFonts w:ascii="Aptos Mono" w:hAnsi="Aptos Mono" w:eastAsia="Aptos Mono"/>
+          <w:b w:val="0"/>
+          <w:i w:val="0"/>
+          <w:color w:val="1F252B"/>
+          <w:sz w:val="19"/>
+          <w:shd w:fill="F1F3F5"/>
+        </w:rPr>
+        <w:t>(L,q)</w:t>
+      </w:r>
+      <w:r>
+        <w:rPr>
+          <w:rFonts w:ascii="Aptos" w:hAnsi="Aptos" w:eastAsia="Aptos"/>
+          <w:b w:val="0"/>
+          <w:i w:val="0"/>
+          <w:color w:val="1F252B"/>
+          <w:sz w:val="21"/>
+        </w:rPr>
+        <w:t xml:space="preserve"> rows have strictly positive finite probe visibility. Under the adopted, project-native finite ARGER Gate, those facts establish the finite Gravity Formation Theory </w:t>
+      </w:r>
+      <w:r>
+        <w:rPr>
+          <w:rFonts w:ascii="Aptos Mono" w:hAnsi="Aptos Mono" w:eastAsia="Aptos Mono"/>
+          <w:b w:val="0"/>
+          <w:i w:val="0"/>
+          <w:color w:val="1F252B"/>
+          <w:sz w:val="19"/>
+          <w:shd w:fill="F1F3F5"/>
+        </w:rPr>
+        <w:t>z=1</w:t>
+      </w:r>
+      <w:r>
+        <w:rPr>
+          <w:rFonts w:ascii="Aptos" w:hAnsi="Aptos" w:eastAsia="Aptos"/>
+          <w:b w:val="0"/>
+          <w:i w:val="0"/>
+          <w:color w:val="1F252B"/>
+          <w:sz w:val="21"/>
+        </w:rPr>
+        <w:t xml:space="preserve"> classification. Here, finite identifies the exact authenticated theorem domain and the complete declared classification. A separate analytic theorem conditionally establishes the standard thermodynamic dynamical exponent </w:t>
+      </w:r>
+      <w:r>
+        <w:rPr>
+          <w:rFonts w:ascii="Aptos Mono" w:hAnsi="Aptos Mono" w:eastAsia="Aptos Mono"/>
+          <w:b w:val="0"/>
+          <w:i w:val="0"/>
+          <w:color w:val="1F252B"/>
+          <w:sz w:val="19"/>
+          <w:shd w:fill="F1F3F5"/>
+        </w:rPr>
+        <w:t>z=1</w:t>
+      </w:r>
+      <w:r>
+        <w:rPr>
+          <w:rFonts w:ascii="Aptos" w:hAnsi="Aptos" w:eastAsia="Aptos"/>
+          <w:b w:val="0"/>
+          <w:i w:val="0"/>
+          <w:color w:val="1F252B"/>
+          <w:sz w:val="21"/>
+        </w:rPr>
+        <w:t xml:space="preserve"> under its named same-model Luttinger-liquid premise (LL-P).</w:t>
       </w:r>
     </w:p>
     <w:p>
@@ -520,6 +551,36 @@
       <w:r>
         <w:rPr>
           <w:rFonts w:ascii="Aptos" w:hAnsi="Aptos" w:eastAsia="Aptos"/>
+          <w:b/>
+          <w:i w:val="0"/>
+          <w:color w:val="1F252B"/>
+          <w:sz w:val="21"/>
+        </w:rPr>
+        <w:t>Execution Architecture: An Intelition Project</w:t>
+      </w:r>
+    </w:p>
+    <w:p>
+      <w:pPr>
+        <w:spacing w:after="110" w:line="274" w:lineRule="auto"/>
+      </w:pPr>
+      <w:r>
+        <w:rPr>
+          <w:rFonts w:ascii="Aptos" w:hAnsi="Aptos" w:eastAsia="Aptos"/>
+          <w:b w:val="0"/>
+          <w:i w:val="0"/>
+          <w:color w:val="1F252B"/>
+          <w:sz w:val="21"/>
+        </w:rPr>
+        <w:t>Universal Network Theory was architected and executed by one human directing a unified ensemble of frontier artificial intelligence (AI) models. The exact mathematical theorems, simulation code, and structural prose indexed in this repository were compiled through continuous, active integration with ChatGPT 5.6 Sol Ultra, Gemini Extended, Claude Opus 5 Ultra, and Grok 4.6.</w:t>
+      </w:r>
+    </w:p>
+    <w:p>
+      <w:pPr>
+        <w:spacing w:after="110" w:line="274" w:lineRule="auto"/>
+      </w:pPr>
+      <w:r>
+        <w:rPr>
+          <w:rFonts w:ascii="Aptos" w:hAnsi="Aptos" w:eastAsia="Aptos"/>
           <w:b w:val="0"/>
           <w:i w:val="0"/>
           <w:color w:val="1F252B"/>
@@ -527,7 +588,7 @@
         </w:rPr>
         <w:t xml:space="preserve">This repository is formally governed as an </w:t>
       </w:r>
-      <w:hyperlink r:id="rId11" w:history="1">
+      <w:hyperlink r:id="rId12" w:history="1">
         <w:r>
           <w:rPr>
             <w:color w:val="1D5D88"/>
@@ -548,7 +609,7 @@
         </w:rPr>
         <w:t xml:space="preserve">—a framework where artificial intelligence operates as an integrated structural partner. The foundational premise for this execution model was introduced in </w:t>
       </w:r>
-      <w:hyperlink r:id="rId12" w:history="1">
+      <w:hyperlink r:id="rId13" w:history="1">
         <w:r>
           <w:rPr>
             <w:color w:val="1D5D88"/>
@@ -1401,7 +1462,7 @@
         </w:rPr>
         <w:t xml:space="preserve"> </w:t>
       </w:r>
-      <w:hyperlink r:id="rId13" w:history="1">
+      <w:hyperlink r:id="rId14" w:history="1">
         <w:r>
           <w:rPr>
             <w:color w:val="1D5D88"/>
@@ -1422,7 +1483,7 @@
         </w:rPr>
         <w:t xml:space="preserve">, the source ledgers, and the generated </w:t>
       </w:r>
-      <w:hyperlink r:id="rId14" w:history="1">
+      <w:hyperlink r:id="rId15" w:history="1">
         <w:r>
           <w:rPr>
             <w:color w:val="1D5D88"/>
@@ -1443,7 +1504,7 @@
         </w:rPr>
         <w:t xml:space="preserve">, </w:t>
       </w:r>
-      <w:hyperlink r:id="rId15" w:history="1">
+      <w:hyperlink r:id="rId16" w:history="1">
         <w:r>
           <w:rPr>
             <w:color w:val="1D5D88"/>
@@ -1464,7 +1525,7 @@
         </w:rPr>
         <w:t xml:space="preserve">, </w:t>
       </w:r>
-      <w:hyperlink r:id="rId16" w:history="1">
+      <w:hyperlink r:id="rId17" w:history="1">
         <w:r>
           <w:rPr>
             <w:color w:val="1D5D88"/>
@@ -1485,7 +1546,7 @@
         </w:rPr>
         <w:t xml:space="preserve">, and </w:t>
       </w:r>
-      <w:hyperlink r:id="rId17" w:history="1">
+      <w:hyperlink r:id="rId18" w:history="1">
         <w:r>
           <w:rPr>
             <w:color w:val="1D5D88"/>
@@ -2296,7 +2357,7 @@
         </w:rPr>
         <w:t xml:space="preserve"> is the runnable real-surface status defined in </w:t>
       </w:r>
-      <w:hyperlink r:id="rId17" w:history="1">
+      <w:hyperlink r:id="rId18" w:history="1">
         <w:r>
           <w:rPr>
             <w:color w:val="1D5D88"/>
@@ -2353,7 +2414,7 @@
         </w:rPr>
         <w:t xml:space="preserve">The append-only correction history is </w:t>
       </w:r>
-      <w:hyperlink r:id="rId18" w:history="1">
+      <w:hyperlink r:id="rId19" w:history="1">
         <w:r>
           <w:rPr>
             <w:color w:val="1D5D88"/>
@@ -2374,7 +2435,7 @@
         </w:rPr>
         <w:t xml:space="preserve">, and the vocabulary and ownership of terms are in </w:t>
       </w:r>
-      <w:hyperlink r:id="rId19" w:history="1">
+      <w:hyperlink r:id="rId20" w:history="1">
         <w:r>
           <w:rPr>
             <w:color w:val="1D5D88"/>
@@ -2434,7 +2495,7 @@
         </w:rPr>
         <w:t xml:space="preserve">1. </w:t>
       </w:r>
-      <w:hyperlink r:id="rId20" w:history="1">
+      <w:hyperlink r:id="rId21" w:history="1">
         <w:r>
           <w:rPr>
             <w:color w:val="1D5D88"/>
@@ -2469,7 +2530,7 @@
         </w:rPr>
         <w:t xml:space="preserve">2. </w:t>
       </w:r>
-      <w:hyperlink r:id="rId21" w:history="1">
+      <w:hyperlink r:id="rId22" w:history="1">
         <w:r>
           <w:rPr>
             <w:color w:val="1D5D88"/>
@@ -2514,7 +2575,7 @@
         </w:rPr>
         <w:t xml:space="preserve">The current FORMATION layer in </w:t>
       </w:r>
-      <w:hyperlink r:id="rId17" w:history="1">
+      <w:hyperlink r:id="rId18" w:history="1">
         <w:r>
           <w:rPr>
             <w:color w:val="1D5D88"/>
@@ -2535,7 +2596,7 @@
         </w:rPr>
         <w:t xml:space="preserve">, its canonical source </w:t>
       </w:r>
-      <w:hyperlink r:id="rId22" w:history="1">
+      <w:hyperlink r:id="rId23" w:history="1">
         <w:r>
           <w:rPr>
             <w:color w:val="1D5D88"/>
@@ -2556,7 +2617,7 @@
         </w:rPr>
         <w:t xml:space="preserve">, and the formation surfaces in </w:t>
       </w:r>
-      <w:hyperlink r:id="rId13" w:history="1">
+      <w:hyperlink r:id="rId14" w:history="1">
         <w:r>
           <w:rPr>
             <w:color w:val="1D5D88"/>
@@ -2577,7 +2638,7 @@
         </w:rPr>
         <w:t xml:space="preserve"> — the exact/finite formation results and their world-contact limits. The earlier </w:t>
       </w:r>
-      <w:hyperlink r:id="rId23" w:history="1">
+      <w:hyperlink r:id="rId24" w:history="1">
         <w:r>
           <w:rPr>
             <w:color w:val="1D5D88"/>
@@ -2685,7 +2746,7 @@
         </w:rPr>
         <w:t xml:space="preserve"> in </w:t>
       </w:r>
-      <w:hyperlink r:id="rId14" w:history="1">
+      <w:hyperlink r:id="rId15" w:history="1">
         <w:r>
           <w:rPr>
             <w:color w:val="1D5D88"/>
@@ -2720,7 +2781,7 @@
         </w:rPr>
         <w:t xml:space="preserve">5. </w:t>
       </w:r>
-      <w:hyperlink r:id="rId24" w:history="1">
+      <w:hyperlink r:id="rId25" w:history="1">
         <w:r>
           <w:rPr>
             <w:color w:val="1D5D88"/>
@@ -2741,7 +2802,7 @@
         </w:rPr>
         <w:t xml:space="preserve">, then the </w:t>
       </w:r>
-      <w:hyperlink r:id="rId25" w:history="1">
+      <w:hyperlink r:id="rId26" w:history="1">
         <w:r>
           <w:rPr>
             <w:color w:val="1D5D88"/>
@@ -2762,7 +2823,7 @@
         </w:rPr>
         <w:t xml:space="preserve"> and its </w:t>
       </w:r>
-      <w:hyperlink r:id="rId26" w:history="1">
+      <w:hyperlink r:id="rId27" w:history="1">
         <w:r>
           <w:rPr>
             <w:color w:val="1D5D88"/>
@@ -2797,7 +2858,7 @@
         </w:rPr>
         <w:t xml:space="preserve">6. </w:t>
       </w:r>
-      <w:hyperlink r:id="rId27" w:history="1">
+      <w:hyperlink r:id="rId28" w:history="1">
         <w:r>
           <w:rPr>
             <w:color w:val="1D5D88"/>
@@ -2818,7 +2879,7 @@
         </w:rPr>
         <w:t xml:space="preserve"> and </w:t>
       </w:r>
-      <w:hyperlink r:id="rId28" w:history="1">
+      <w:hyperlink r:id="rId29" w:history="1">
         <w:r>
           <w:rPr>
             <w:color w:val="1D5D88"/>
@@ -2853,7 +2914,7 @@
         </w:rPr>
         <w:t xml:space="preserve">7. </w:t>
       </w:r>
-      <w:hyperlink r:id="rId29" w:history="1">
+      <w:hyperlink r:id="rId30" w:history="1">
         <w:r>
           <w:rPr>
             <w:color w:val="1D5D88"/>
@@ -2874,7 +2935,7 @@
         </w:rPr>
         <w:t xml:space="preserve"> and its </w:t>
       </w:r>
-      <w:hyperlink r:id="rId30" w:history="1">
+      <w:hyperlink r:id="rId31" w:history="1">
         <w:r>
           <w:rPr>
             <w:color w:val="1D5D88"/>
@@ -2909,7 +2970,7 @@
         </w:rPr>
         <w:t xml:space="preserve">8. </w:t>
       </w:r>
-      <w:hyperlink r:id="rId31" w:history="1">
+      <w:hyperlink r:id="rId32" w:history="1">
         <w:r>
           <w:rPr>
             <w:color w:val="1D5D88"/>
@@ -2965,7 +3026,7 @@
         </w:rPr>
         <w:t xml:space="preserve">9. </w:t>
       </w:r>
-      <w:hyperlink r:id="rId13" w:history="1">
+      <w:hyperlink r:id="rId14" w:history="1">
         <w:r>
           <w:rPr>
             <w:color w:val="1D5D88"/>
@@ -3000,7 +3061,7 @@
         </w:rPr>
         <w:t xml:space="preserve">10. </w:t>
       </w:r>
-      <w:hyperlink r:id="rId32" w:history="1">
+      <w:hyperlink r:id="rId33" w:history="1">
         <w:r>
           <w:rPr>
             <w:color w:val="1D5D88"/>
@@ -3021,7 +3082,7 @@
         </w:rPr>
         <w:t xml:space="preserve"> and its </w:t>
       </w:r>
-      <w:hyperlink r:id="rId33" w:history="1">
+      <w:hyperlink r:id="rId34" w:history="1">
         <w:r>
           <w:rPr>
             <w:color w:val="1D5D88"/>
@@ -3056,7 +3117,7 @@
         </w:rPr>
         <w:t xml:space="preserve">11. </w:t>
       </w:r>
-      <w:hyperlink r:id="rId34" w:history="1">
+      <w:hyperlink r:id="rId35" w:history="1">
         <w:r>
           <w:rPr>
             <w:color w:val="1D5D88"/>
@@ -3077,7 +3138,7 @@
         </w:rPr>
         <w:t xml:space="preserve"> and its </w:t>
       </w:r>
-      <w:hyperlink r:id="rId35" w:history="1">
+      <w:hyperlink r:id="rId36" w:history="1">
         <w:r>
           <w:rPr>
             <w:color w:val="1D5D88"/>
@@ -3185,7 +3246,7 @@
         </w:rPr>
         <w:t xml:space="preserve"> in </w:t>
       </w:r>
-      <w:hyperlink r:id="rId14" w:history="1">
+      <w:hyperlink r:id="rId15" w:history="1">
         <w:r>
           <w:rPr>
             <w:color w:val="1D5D88"/>
@@ -3206,7 +3267,7 @@
         </w:rPr>
         <w:t xml:space="preserve">, plus </w:t>
       </w:r>
-      <w:hyperlink r:id="rId36" w:history="1">
+      <w:hyperlink r:id="rId37" w:history="1">
         <w:r>
           <w:rPr>
             <w:color w:val="1D5D88"/>
@@ -3262,7 +3323,7 @@
         </w:rPr>
         <w:t xml:space="preserve">13. </w:t>
       </w:r>
-      <w:hyperlink r:id="rId37" w:history="1">
+      <w:hyperlink r:id="rId38" w:history="1">
         <w:r>
           <w:rPr>
             <w:color w:val="1D5D88"/>
@@ -3312,7 +3373,7 @@
       <w:pPr>
         <w:spacing w:after="110" w:line="274" w:lineRule="auto"/>
       </w:pPr>
-      <w:hyperlink r:id="rId17" w:history="1">
+      <w:hyperlink r:id="rId18" w:history="1">
         <w:r>
           <w:rPr>
             <w:color w:val="1D5D88"/>
@@ -4923,7 +4984,7 @@
         </w:rPr>
         <w:t xml:space="preserve">The wider canonical program map remains in </w:t>
       </w:r>
-      <w:hyperlink r:id="rId40" w:history="1">
+      <w:hyperlink r:id="rId41" w:history="1">
         <w:r>
           <w:rPr>
             <w:color w:val="1D5D88"/>
@@ -5177,7 +5238,7 @@
               <w:spacing w:before="0" w:after="0" w:line="252" w:lineRule="auto"/>
               <w:jc w:val="left"/>
             </w:pPr>
-            <w:hyperlink r:id="rId20" w:history="1">
+            <w:hyperlink r:id="rId21" w:history="1">
               <w:r>
                 <w:rPr>
                   <w:color w:val="1D5D88"/>
@@ -5394,7 +5455,7 @@
               <w:spacing w:before="0" w:after="0" w:line="252" w:lineRule="auto"/>
               <w:jc w:val="left"/>
             </w:pPr>
-            <w:hyperlink r:id="rId41" w:history="1">
+            <w:hyperlink r:id="rId42" w:history="1">
               <w:r>
                 <w:rPr>
                   <w:color w:val="1D5D88"/>
@@ -5424,7 +5485,7 @@
               <w:spacing w:before="0" w:after="0" w:line="252" w:lineRule="auto"/>
               <w:jc w:val="left"/>
             </w:pPr>
-            <w:hyperlink r:id="rId42" w:history="1">
+            <w:hyperlink r:id="rId43" w:history="1">
               <w:r>
                 <w:rPr>
                   <w:color w:val="1D5D88"/>
@@ -5684,7 +5745,7 @@
               </w:rPr>
               <w:t xml:space="preserve"> in </w:t>
             </w:r>
-            <w:hyperlink r:id="rId14" w:history="1">
+            <w:hyperlink r:id="rId15" w:history="1">
               <w:r>
                 <w:rPr>
                   <w:color w:val="1D5D88"/>
@@ -5848,7 +5909,7 @@
               <w:spacing w:before="0" w:after="0" w:line="252" w:lineRule="auto"/>
               <w:jc w:val="left"/>
             </w:pPr>
-            <w:hyperlink r:id="rId24" w:history="1">
+            <w:hyperlink r:id="rId25" w:history="1">
               <w:r>
                 <w:rPr>
                   <w:color w:val="1D5D88"/>
@@ -5869,7 +5930,7 @@
               </w:rPr>
               <w:t xml:space="preserve">, </w:t>
             </w:r>
-            <w:hyperlink r:id="rId25" w:history="1">
+            <w:hyperlink r:id="rId26" w:history="1">
               <w:r>
                 <w:rPr>
                   <w:color w:val="1D5D88"/>
@@ -5899,7 +5960,7 @@
               <w:spacing w:before="0" w:after="0" w:line="252" w:lineRule="auto"/>
               <w:jc w:val="left"/>
             </w:pPr>
-            <w:hyperlink r:id="rId26" w:history="1">
+            <w:hyperlink r:id="rId27" w:history="1">
               <w:r>
                 <w:rPr>
                   <w:color w:val="1D5D88"/>
@@ -6118,7 +6179,7 @@
               <w:spacing w:before="0" w:after="0" w:line="252" w:lineRule="auto"/>
               <w:jc w:val="left"/>
             </w:pPr>
-            <w:hyperlink r:id="rId43" w:history="1">
+            <w:hyperlink r:id="rId44" w:history="1">
               <w:r>
                 <w:rPr>
                   <w:color w:val="1D5D88"/>
@@ -6139,7 +6200,7 @@
               </w:rPr>
               <w:t xml:space="preserve">, </w:t>
             </w:r>
-            <w:hyperlink r:id="rId44" w:history="1">
+            <w:hyperlink r:id="rId45" w:history="1">
               <w:r>
                 <w:rPr>
                   <w:color w:val="1D5D88"/>
@@ -6160,7 +6221,7 @@
               </w:rPr>
               <w:t xml:space="preserve">, </w:t>
             </w:r>
-            <w:hyperlink r:id="rId45" w:history="1">
+            <w:hyperlink r:id="rId46" w:history="1">
               <w:r>
                 <w:rPr>
                   <w:color w:val="1D5D88"/>
@@ -6200,7 +6261,7 @@
               </w:rPr>
               <w:t xml:space="preserve">The lane-specific </w:t>
             </w:r>
-            <w:hyperlink r:id="rId46" w:history="1">
+            <w:hyperlink r:id="rId47" w:history="1">
               <w:r>
                 <w:rPr>
                   <w:color w:val="1D5D88"/>
@@ -6221,7 +6282,7 @@
               </w:rPr>
               <w:t xml:space="preserve"> and </w:t>
             </w:r>
-            <w:hyperlink r:id="rId47" w:history="1">
+            <w:hyperlink r:id="rId48" w:history="1">
               <w:r>
                 <w:rPr>
                   <w:color w:val="1D5D88"/>
@@ -6324,7 +6385,7 @@
               <w:spacing w:before="0" w:after="0" w:line="252" w:lineRule="auto"/>
               <w:jc w:val="left"/>
             </w:pPr>
-            <w:hyperlink r:id="rId32" w:history="1">
+            <w:hyperlink r:id="rId33" w:history="1">
               <w:r>
                 <w:rPr>
                   <w:color w:val="1D5D88"/>
@@ -6364,7 +6425,7 @@
               </w:rPr>
               <w:t xml:space="preserve">Its </w:t>
             </w:r>
-            <w:hyperlink r:id="rId33" w:history="1">
+            <w:hyperlink r:id="rId34" w:history="1">
               <w:r>
                 <w:rPr>
                   <w:color w:val="1D5D88"/>
@@ -6530,7 +6591,7 @@
               <w:spacing w:before="0" w:after="0" w:line="252" w:lineRule="auto"/>
               <w:jc w:val="left"/>
             </w:pPr>
-            <w:hyperlink r:id="rId41" w:history="1">
+            <w:hyperlink r:id="rId42" w:history="1">
               <w:r>
                 <w:rPr>
                   <w:color w:val="1D5D88"/>
@@ -6551,7 +6612,7 @@
               </w:rPr>
               <w:t xml:space="preserve">, </w:t>
             </w:r>
-            <w:hyperlink r:id="rId48" w:history="1">
+            <w:hyperlink r:id="rId49" w:history="1">
               <w:r>
                 <w:rPr>
                   <w:color w:val="1D5D88"/>
@@ -6581,7 +6642,7 @@
               <w:spacing w:before="0" w:after="0" w:line="252" w:lineRule="auto"/>
               <w:jc w:val="left"/>
             </w:pPr>
-            <w:hyperlink r:id="rId42" w:history="1">
+            <w:hyperlink r:id="rId43" w:history="1">
               <w:r>
                 <w:rPr>
                   <w:color w:val="1D5D88"/>
@@ -6602,7 +6663,7 @@
               </w:rPr>
               <w:t xml:space="preserve">, </w:t>
             </w:r>
-            <w:hyperlink r:id="rId49" w:history="1">
+            <w:hyperlink r:id="rId50" w:history="1">
               <w:r>
                 <w:rPr>
                   <w:color w:val="1D5D88"/>
@@ -6716,7 +6777,7 @@
               <w:spacing w:before="0" w:after="0" w:line="252" w:lineRule="auto"/>
               <w:jc w:val="left"/>
             </w:pPr>
-            <w:hyperlink r:id="rId50" w:history="1">
+            <w:hyperlink r:id="rId51" w:history="1">
               <w:r>
                 <w:rPr>
                   <w:color w:val="1D5D88"/>
@@ -6737,7 +6798,7 @@
               </w:rPr>
               <w:t xml:space="preserve">, </w:t>
             </w:r>
-            <w:hyperlink r:id="rId51" w:history="1">
+            <w:hyperlink r:id="rId52" w:history="1">
               <w:r>
                 <w:rPr>
                   <w:color w:val="1D5D88"/>
@@ -7006,7 +7067,7 @@
               <w:spacing w:before="0" w:after="0" w:line="252" w:lineRule="auto"/>
               <w:jc w:val="left"/>
             </w:pPr>
-            <w:hyperlink r:id="rId29" w:history="1">
+            <w:hyperlink r:id="rId30" w:history="1">
               <w:r>
                 <w:rPr>
                   <w:color w:val="1D5D88"/>
@@ -7036,7 +7097,7 @@
               <w:spacing w:before="0" w:after="0" w:line="252" w:lineRule="auto"/>
               <w:jc w:val="left"/>
             </w:pPr>
-            <w:hyperlink r:id="rId30" w:history="1">
+            <w:hyperlink r:id="rId31" w:history="1">
               <w:r>
                 <w:rPr>
                   <w:color w:val="1D5D88"/>
@@ -7213,7 +7274,7 @@
               <w:spacing w:before="0" w:after="0" w:line="252" w:lineRule="auto"/>
               <w:jc w:val="left"/>
             </w:pPr>
-            <w:hyperlink r:id="rId31" w:history="1">
+            <w:hyperlink r:id="rId32" w:history="1">
               <w:r>
                 <w:rPr>
                   <w:color w:val="1D5D88"/>
@@ -7356,7 +7417,7 @@
               <w:spacing w:before="0" w:after="0" w:line="252" w:lineRule="auto"/>
               <w:jc w:val="left"/>
             </w:pPr>
-            <w:hyperlink r:id="rId28" w:history="1">
+            <w:hyperlink r:id="rId29" w:history="1">
               <w:r>
                 <w:rPr>
                   <w:color w:val="1D5D88"/>
@@ -7499,7 +7560,7 @@
               <w:spacing w:before="0" w:after="0" w:line="252" w:lineRule="auto"/>
               <w:jc w:val="left"/>
             </w:pPr>
-            <w:hyperlink r:id="rId52" w:history="1">
+            <w:hyperlink r:id="rId53" w:history="1">
               <w:r>
                 <w:rPr>
                   <w:color w:val="1D5D88"/>
@@ -7551,8 +7612,8 @@
     <w:p>
       <w:pPr>
         <w:sectPr>
-          <w:headerReference w:type="default" r:id="rId38"/>
-          <w:footerReference w:type="default" r:id="rId39"/>
+          <w:headerReference w:type="default" r:id="rId39"/>
+          <w:footerReference w:type="default" r:id="rId40"/>
           <w:pgSz w:w="15840" w:h="12240" w:orient="landscape"/>
           <w:pgMar w:top="835" w:right="806" w:bottom="893" w:left="806" w:header="432" w:footer="432" w:gutter="0"/>
           <w:cols w:space="720"/>
@@ -7584,7 +7645,7 @@
         </w:rPr>
         <w:t xml:space="preserve">The controlling UNT composition is </w:t>
       </w:r>
-      <w:hyperlink r:id="rId20" w:history="1">
+      <w:hyperlink r:id="rId21" w:history="1">
         <w:r>
           <w:rPr>
             <w:color w:val="1D5D88"/>
@@ -7825,7 +7886,7 @@
         </w:rPr>
         <w:t xml:space="preserve">The authoritative infrared-response theorem is </w:t>
       </w:r>
-      <w:hyperlink r:id="rId32" w:history="1">
+      <w:hyperlink r:id="rId33" w:history="1">
         <w:r>
           <w:rPr>
             <w:color w:val="1D5D88"/>
@@ -7867,7 +7928,7 @@
         </w:rPr>
         <w:t xml:space="preserve"> in its internal </w:t>
       </w:r>
-      <w:hyperlink r:id="rId33" w:history="1">
+      <w:hyperlink r:id="rId34" w:history="1">
         <w:r>
           <w:rPr>
             <w:color w:val="1D5D88"/>
@@ -7888,7 +7949,7 @@
         </w:rPr>
         <w:t xml:space="preserve">. </w:t>
       </w:r>
-      <w:hyperlink r:id="rId34" w:history="1">
+      <w:hyperlink r:id="rId35" w:history="1">
         <w:r>
           <w:rPr>
             <w:color w:val="1D5D88"/>
@@ -7909,7 +7970,7 @@
         </w:rPr>
         <w:t xml:space="preserve"> and its </w:t>
       </w:r>
-      <w:hyperlink r:id="rId35" w:history="1">
+      <w:hyperlink r:id="rId36" w:history="1">
         <w:r>
           <w:rPr>
             <w:color w:val="1D5D88"/>
@@ -8266,7 +8327,7 @@
         </w:rPr>
         <w:t xml:space="preserve">The URM is the project's executable integration surface. The controlling physical authority resides in the theorem, evidence, and audit artifacts indexed below. </w:t>
       </w:r>
-      <w:hyperlink r:id="rId13" w:history="1">
+      <w:hyperlink r:id="rId14" w:history="1">
         <w:r>
           <w:rPr>
             <w:color w:val="1D5D88"/>
@@ -8287,7 +8348,7 @@
         </w:rPr>
         <w:t xml:space="preserve"> defines the model, and </w:t>
       </w:r>
-      <w:hyperlink r:id="rId55" w:history="1">
+      <w:hyperlink r:id="rId56" w:history="1">
         <w:r>
           <w:rPr>
             <w:color w:val="1D5D88"/>
@@ -9787,7 +9848,7 @@
         </w:rPr>
         <w:t xml:space="preserve">The historical and Git provenance is catalogued in </w:t>
       </w:r>
-      <w:hyperlink r:id="rId37" w:history="1">
+      <w:hyperlink r:id="rId38" w:history="1">
         <w:r>
           <w:rPr>
             <w:color w:val="1D5D88"/>
@@ -10053,7 +10114,7 @@
         </w:rPr>
         <w:t xml:space="preserve">. The exact paths, hashes, commits, and canonical selection record are recorded in </w:t>
       </w:r>
-      <w:hyperlink r:id="rId56" w:history="1">
+      <w:hyperlink r:id="rId57" w:history="1">
         <w:r>
           <w:rPr>
             <w:color w:val="1D5D88"/>
@@ -10635,7 +10696,7 @@
         </w:rPr>
         <w:t xml:space="preserve">The targeted extractor </w:t>
       </w:r>
-      <w:hyperlink r:id="rId57" w:history="1">
+      <w:hyperlink r:id="rId58" w:history="1">
         <w:r>
           <w:rPr>
             <w:color w:val="1D5D88"/>
@@ -11897,7 +11958,7 @@
         </w:rPr>
         <w:t xml:space="preserve">The capsule's compact, path-neutral authentication record is </w:t>
       </w:r>
-      <w:hyperlink r:id="rId58" w:history="1">
+      <w:hyperlink r:id="rId59" w:history="1">
         <w:r>
           <w:rPr>
             <w:color w:val="1D5D88"/>
@@ -13658,7 +13719,7 @@
         </w:rPr>
         <w:t xml:space="preserve">Git contains the complete chronological research record: source code, theorem development, authenticated evidence, audits, corrections, superseded routes, and release history. The public repository is </w:t>
       </w:r>
-      <w:hyperlink r:id="rId59" w:history="1">
+      <w:hyperlink r:id="rId60" w:history="1">
         <w:r>
           <w:rPr>
             <w:color w:val="1D5D88"/>
@@ -13896,7 +13957,7 @@
         </w:rPr>
         <w:t xml:space="preserve">The current run is recorded in </w:t>
       </w:r>
-      <w:hyperlink r:id="rId60" w:history="1">
+      <w:hyperlink r:id="rId61" w:history="1">
         <w:r>
           <w:rPr>
             <w:color w:val="1D5D88"/>
@@ -15624,7 +15685,7 @@
         </w:rPr>
         <w:t xml:space="preserve">, 166--176 (2023), </w:t>
       </w:r>
-      <w:hyperlink r:id="rId61" w:history="1">
+      <w:hyperlink r:id="rId62" w:history="1">
         <w:r>
           <w:rPr>
             <w:color w:val="1D5D88"/>
@@ -15709,7 +15770,7 @@
         </w:rPr>
         <w:t xml:space="preserve">, 4423--4439 (1999), </w:t>
       </w:r>
-      <w:hyperlink r:id="rId62" w:history="1">
+      <w:hyperlink r:id="rId63" w:history="1">
         <w:r>
           <w:rPr>
             <w:color w:val="1D5D88"/>
@@ -15858,7 +15919,7 @@
         </w:rPr>
         <w:t xml:space="preserve">, 562--572 (1949), </w:t>
       </w:r>
-      <w:hyperlink r:id="rId63" w:history="1">
+      <w:hyperlink r:id="rId64" w:history="1">
         <w:r>
           <w:rPr>
             <w:color w:val="1D5D88"/>
@@ -15943,7 +16004,7 @@
         </w:rPr>
         <w:t xml:space="preserve">, 6413--6418 (1994), </w:t>
       </w:r>
-      <w:hyperlink r:id="rId64" w:history="1">
+      <w:hyperlink r:id="rId65" w:history="1">
         <w:r>
           <w:rPr>
             <w:color w:val="1D5D88"/>
@@ -16028,7 +16089,7 @@
         </w:rPr>
         <w:t xml:space="preserve">, 978--983 (1997), </w:t>
       </w:r>
-      <w:hyperlink r:id="rId65" w:history="1">
+      <w:hyperlink r:id="rId66" w:history="1">
         <w:r>
           <w:rPr>
             <w:color w:val="1D5D88"/>
@@ -16113,7 +16174,7 @@
         </w:rPr>
         <w:t xml:space="preserve">, 5478--5480 (1994), </w:t>
       </w:r>
-      <w:hyperlink r:id="rId66" w:history="1">
+      <w:hyperlink r:id="rId67" w:history="1">
         <w:r>
           <w:rPr>
             <w:color w:val="1D5D88"/>
@@ -16198,7 +16259,7 @@
         </w:rPr>
         <w:t xml:space="preserve">, 065303 (2009), </w:t>
       </w:r>
-      <w:hyperlink r:id="rId67" w:history="1">
+      <w:hyperlink r:id="rId68" w:history="1">
         <w:r>
           <w:rPr>
             <w:color w:val="1D5D88"/>
@@ -16219,7 +16280,7 @@
         </w:rPr>
         <w:t xml:space="preserve">, </w:t>
       </w:r>
-      <w:hyperlink r:id="rId68" w:history="1">
+      <w:hyperlink r:id="rId69" w:history="1">
         <w:r>
           <w:rPr>
             <w:color w:val="1D5D88"/>
@@ -16304,7 +16365,7 @@
         </w:rPr>
         <w:t xml:space="preserve">, 91--110 (1974), </w:t>
       </w:r>
-      <w:hyperlink r:id="rId69" w:history="1">
+      <w:hyperlink r:id="rId70" w:history="1">
         <w:r>
           <w:rPr>
             <w:color w:val="1D5D88"/>
@@ -16389,7 +16450,7 @@
         </w:rPr>
         <w:t xml:space="preserve">, 177--183 (1973), </w:t>
       </w:r>
-      <w:hyperlink r:id="rId70" w:history="1">
+      <w:hyperlink r:id="rId71" w:history="1">
         <w:r>
           <w:rPr>
             <w:color w:val="1D5D88"/>
@@ -16474,7 +16535,7 @@
         </w:rPr>
         <w:t xml:space="preserve">, 401--419 (1952), </w:t>
       </w:r>
-      <w:hyperlink r:id="rId71" w:history="1">
+      <w:hyperlink r:id="rId72" w:history="1">
         <w:r>
           <w:rPr>
             <w:color w:val="1D5D88"/>
@@ -16559,7 +16620,7 @@
         </w:rPr>
         <w:t xml:space="preserve">, 248--263 (1907), </w:t>
       </w:r>
-      <w:hyperlink r:id="rId72" w:history="1">
+      <w:hyperlink r:id="rId73" w:history="1">
         <w:r>
           <w:rPr>
             <w:color w:val="1D5D88"/>
@@ -16644,7 +16705,7 @@
         </w:rPr>
         <w:t xml:space="preserve">, 456--477 (1912), </w:t>
       </w:r>
-      <w:hyperlink r:id="rId73" w:history="1">
+      <w:hyperlink r:id="rId74" w:history="1">
         <w:r>
           <w:rPr>
             <w:color w:val="1D5D88"/>
@@ -16729,7 +16790,7 @@
         </w:rPr>
         <w:t xml:space="preserve">, 749--754 (1931), </w:t>
       </w:r>
-      <w:hyperlink r:id="rId74" w:history="1">
+      <w:hyperlink r:id="rId75" w:history="1">
         <w:r>
           <w:rPr>
             <w:color w:val="1D5D88"/>
@@ -16814,7 +16875,7 @@
         </w:rPr>
         <w:t xml:space="preserve">, 211--216 (1955), </w:t>
       </w:r>
-      <w:hyperlink r:id="rId75" w:history="1">
+      <w:hyperlink r:id="rId76" w:history="1">
         <w:r>
           <w:rPr>
             <w:color w:val="1D5D88"/>
@@ -16899,7 +16960,7 @@
         </w:rPr>
         <w:t xml:space="preserve">, 96--115 (1927), </w:t>
       </w:r>
-      <w:hyperlink r:id="rId76" w:history="1">
+      <w:hyperlink r:id="rId77" w:history="1">
         <w:r>
           <w:rPr>
             <w:color w:val="1D5D88"/>
@@ -16984,7 +17045,7 @@
         </w:rPr>
         <w:t xml:space="preserve">, 524--530 (2023), </w:t>
       </w:r>
-      <w:hyperlink r:id="rId77" w:history="1">
+      <w:hyperlink r:id="rId78" w:history="1">
         <w:r>
           <w:rPr>
             <w:color w:val="1D5D88"/>
@@ -17069,7 +17130,7 @@
         </w:rPr>
         <w:t xml:space="preserve">, 1099--1107 (2013), </w:t>
       </w:r>
-      <w:hyperlink r:id="rId78" w:history="1">
+      <w:hyperlink r:id="rId79" w:history="1">
         <w:r>
           <w:rPr>
             <w:color w:val="1D5D88"/>
@@ -17134,7 +17195,7 @@
         </w:rPr>
         <w:t xml:space="preserve">, JESD218B.01 (2016), </w:t>
       </w:r>
-      <w:hyperlink r:id="rId79" w:history="1">
+      <w:hyperlink r:id="rId80" w:history="1">
         <w:r>
           <w:rPr>
             <w:color w:val="1D5D88"/>
@@ -17219,7 +17280,7 @@
         </w:rPr>
         <w:t xml:space="preserve">, 181--188 (2009), </w:t>
       </w:r>
-      <w:hyperlink r:id="rId80" w:history="1">
+      <w:hyperlink r:id="rId81" w:history="1">
         <w:r>
           <w:rPr>
             <w:color w:val="1D5D88"/>
@@ -17304,7 +17365,7 @@
         </w:rPr>
         <w:t xml:space="preserve">, 3345--3382 (1993), </w:t>
       </w:r>
-      <w:hyperlink r:id="rId81" w:history="1">
+      <w:hyperlink r:id="rId82" w:history="1">
         <w:r>
           <w:rPr>
             <w:color w:val="1D5D88"/>
@@ -17389,7 +17450,7 @@
         </w:rPr>
         <w:t xml:space="preserve">, 715--775 (2003), </w:t>
       </w:r>
-      <w:hyperlink r:id="rId82" w:history="1">
+      <w:hyperlink r:id="rId83" w:history="1">
         <w:r>
           <w:rPr>
             <w:color w:val="1D5D88"/>
@@ -17474,7 +17535,7 @@
         </w:rPr>
         <w:t xml:space="preserve">, 043029 (2009), </w:t>
       </w:r>
-      <w:hyperlink r:id="rId83" w:history="1">
+      <w:hyperlink r:id="rId84" w:history="1">
         <w:r>
           <w:rPr>
             <w:color w:val="1D5D88"/>
@@ -17559,7 +17620,7 @@
         </w:rPr>
         <w:t xml:space="preserve">, 900--911 (1997), </w:t>
       </w:r>
-      <w:hyperlink r:id="rId84" w:history="1">
+      <w:hyperlink r:id="rId85" w:history="1">
         <w:r>
           <w:rPr>
             <w:color w:val="1D5D88"/>
@@ -17644,7 +17705,7 @@
         </w:rPr>
         <w:t xml:space="preserve">, 2--30 (2003), </w:t>
       </w:r>
-      <w:hyperlink r:id="rId85" w:history="1">
+      <w:hyperlink r:id="rId86" w:history="1">
         <w:r>
           <w:rPr>
             <w:color w:val="1D5D88"/>
@@ -17665,7 +17726,7 @@
         </w:rPr>
         <w:t xml:space="preserve">, </w:t>
       </w:r>
-      <w:hyperlink r:id="rId86" w:history="1">
+      <w:hyperlink r:id="rId87" w:history="1">
         <w:r>
           <w:rPr>
             <w:color w:val="1D5D88"/>
@@ -17750,7 +17811,7 @@
         </w:rPr>
         <w:t xml:space="preserve">, 266--271 (1999), </w:t>
       </w:r>
-      <w:hyperlink r:id="rId87" w:history="1">
+      <w:hyperlink r:id="rId88" w:history="1">
         <w:r>
           <w:rPr>
             <w:color w:val="1D5D88"/>
@@ -17771,7 +17832,7 @@
         </w:rPr>
         <w:t xml:space="preserve">, </w:t>
       </w:r>
-      <w:hyperlink r:id="rId88" w:history="1">
+      <w:hyperlink r:id="rId89" w:history="1">
         <w:r>
           <w:rPr>
             <w:color w:val="1D5D88"/>
@@ -17816,7 +17877,7 @@
         </w:rPr>
         <w:t xml:space="preserve">D. Fattal, T. S. Cubitt, Y. Yamamoto, S. Bravyi, and I. L. Chuang, “Entanglement in the Stabilizer Formalism,” </w:t>
       </w:r>
-      <w:hyperlink r:id="rId89" w:history="1">
+      <w:hyperlink r:id="rId90" w:history="1">
         <w:r>
           <w:rPr>
             <w:color w:val="1D5D88"/>
@@ -17901,7 +17962,7 @@
         </w:rPr>
         <w:t xml:space="preserve">, 110404 (2006), </w:t>
       </w:r>
-      <w:hyperlink r:id="rId90" w:history="1">
+      <w:hyperlink r:id="rId91" w:history="1">
         <w:r>
           <w:rPr>
             <w:color w:val="1D5D88"/>
@@ -17986,7 +18047,7 @@
         </w:rPr>
         <w:t xml:space="preserve">, 110405 (2006), </w:t>
       </w:r>
-      <w:hyperlink r:id="rId91" w:history="1">
+      <w:hyperlink r:id="rId92" w:history="1">
         <w:r>
           <w:rPr>
             <w:color w:val="1D5D88"/>
@@ -18031,7 +18092,7 @@
         </w:rPr>
         <w:t xml:space="preserve">S. B. Bravyi and A. Yu. Kitaev, “Quantum Codes on a Lattice with Boundary,” </w:t>
       </w:r>
-      <w:hyperlink r:id="rId92" w:history="1">
+      <w:hyperlink r:id="rId93" w:history="1">
         <w:r>
           <w:rPr>
             <w:color w:val="1D5D88"/>
@@ -18116,7 +18177,7 @@
         </w:rPr>
         <w:t xml:space="preserve">, 2259--2272 (1971), </w:t>
       </w:r>
-      <w:hyperlink r:id="rId93" w:history="1">
+      <w:hyperlink r:id="rId94" w:history="1">
         <w:r>
           <w:rPr>
             <w:color w:val="1D5D88"/>
@@ -18201,7 +18262,7 @@
         </w:rPr>
         <w:t xml:space="preserve">, 2445--2459 (1974), </w:t>
       </w:r>
-      <w:hyperlink r:id="rId94" w:history="1">
+      <w:hyperlink r:id="rId95" w:history="1">
         <w:r>
           <w:rPr>
             <w:color w:val="1D5D88"/>
@@ -18286,7 +18347,7 @@
         </w:rPr>
         <w:t xml:space="preserve">, 174--181 (1976), </w:t>
       </w:r>
-      <w:hyperlink r:id="rId95" w:history="1">
+      <w:hyperlink r:id="rId96" w:history="1">
         <w:r>
           <w:rPr>
             <w:color w:val="1D5D88"/>
@@ -18371,7 +18432,7 @@
         </w:rPr>
         <w:t xml:space="preserve">, 1399--1404 (1977), </w:t>
       </w:r>
-      <w:hyperlink r:id="rId96" w:history="1">
+      <w:hyperlink r:id="rId97" w:history="1">
         <w:r>
           <w:rPr>
             <w:color w:val="1D5D88"/>
@@ -18456,7 +18517,7 @@
         </w:rPr>
         <w:t xml:space="preserve">, 498--501 (1971), </w:t>
       </w:r>
-      <w:hyperlink r:id="rId97" w:history="1">
+      <w:hyperlink r:id="rId98" w:history="1">
         <w:r>
           <w:rPr>
             <w:color w:val="1D5D88"/>
@@ -18541,7 +18602,7 @@
         </w:rPr>
         <w:t xml:space="preserve">, 054517 (2011), </w:t>
       </w:r>
-      <w:hyperlink r:id="rId98" w:history="1">
+      <w:hyperlink r:id="rId99" w:history="1">
         <w:r>
           <w:rPr>
             <w:color w:val="1D5D88"/>
@@ -18562,7 +18623,7 @@
         </w:rPr>
         <w:t xml:space="preserve">, </w:t>
       </w:r>
-      <w:hyperlink r:id="rId99" w:history="1">
+      <w:hyperlink r:id="rId100" w:history="1">
         <w:r>
           <w:rPr>
             <w:color w:val="1D5D88"/>
@@ -18647,7 +18708,7 @@
         </w:rPr>
         <w:t xml:space="preserve">, 245101 (2011), </w:t>
       </w:r>
-      <w:hyperlink r:id="rId100" w:history="1">
+      <w:hyperlink r:id="rId101" w:history="1">
         <w:r>
           <w:rPr>
             <w:color w:val="1D5D88"/>
@@ -18668,7 +18729,7 @@
         </w:rPr>
         <w:t xml:space="preserve">, </w:t>
       </w:r>
-      <w:hyperlink r:id="rId101" w:history="1">
+      <w:hyperlink r:id="rId102" w:history="1">
         <w:r>
           <w:rPr>
             <w:color w:val="1D5D88"/>
@@ -18753,7 +18814,7 @@
         </w:rPr>
         <w:t xml:space="preserve">, 033105 (2025), </w:t>
       </w:r>
-      <w:hyperlink r:id="rId102" w:history="1">
+      <w:hyperlink r:id="rId103" w:history="1">
         <w:r>
           <w:rPr>
             <w:color w:val="1D5D88"/>
@@ -20144,8 +20205,8 @@
       <w:bookmarkEnd w:id="3"/>
     </w:p>
     <w:sectPr>
-      <w:headerReference w:type="default" r:id="rId53"/>
-      <w:footerReference w:type="default" r:id="rId54"/>
+      <w:headerReference w:type="default" r:id="rId54"/>
+      <w:footerReference w:type="default" r:id="rId55"/>
       <w:pgSz w:w="12240" w:h="15840"/>
       <w:pgMar w:top="979" w:right="1094" w:bottom="1008" w:left="1094" w:header="432" w:footer="432" w:gutter="0"/>
       <w:cols w:space="720"/>

</xml_diff>

<commit_message>
Make Zenodo capsule the canonical release source
</commit_message>
<xml_diff>
--- a/publication/zenodo_reproduction_v001/UNIVERSAL_NETWORK_THEORY_MAJOR_PROOF_INDEX.docx
+++ b/publication/zenodo_reproduction_v001/UNIVERSAL_NETWORK_THEORY_MAJOR_PROOF_INDEX.docx
@@ -571,7 +571,7 @@
           <w:color w:val="1F252B"/>
           <w:sz w:val="21"/>
         </w:rPr>
-        <w:t>Universal Network Theory was architected and executed by one human directing a unified ensemble of frontier artificial intelligence (AI) models. The exact mathematical theorems, simulation code, and structural prose indexed in this repository were compiled through continuous, active integration with ChatGPT 5.6 Sol Ultra, Gemini Extended, Claude Opus 5 Ultra, and Grok 4.6.</w:t>
+        <w:t>Universal Network Theory was architected and executed by one human directing a unified ensemble of frontier artificial intelligence (AI) models. The exact mathematical theorems, simulation code, and structural prose indexed in this deposited release were compiled through continuous, active integration with ChatGPT 5.6 Sol Ultra, Gemini Extended, Claude Opus 5 Ultra, and Grok 4.6.</w:t>
       </w:r>
     </w:p>
     <w:p>
@@ -586,7 +586,7 @@
           <w:color w:val="1F252B"/>
           <w:sz w:val="21"/>
         </w:rPr>
-        <w:t xml:space="preserve">This repository is formally governed as an </w:t>
+        <w:t xml:space="preserve">This project is formally governed as an </w:t>
       </w:r>
       <w:hyperlink r:id="rId12" w:history="1">
         <w:r>
@@ -1414,7 +1414,7 @@
           <w:color w:val="1F252B"/>
           <w:sz w:val="21"/>
         </w:rPr>
-        <w:t xml:space="preserve">Clickable local links use their paths inside the extracted Zenodo capsule. Git-only paths are printed explicitly and marked </w:t>
+        <w:t xml:space="preserve">Clickable local links use their paths inside the extracted Zenodo capsule. Paths marked </w:t>
       </w:r>
       <w:r>
         <w:rPr>
@@ -1435,7 +1435,7 @@
           <w:color w:val="1F252B"/>
           <w:sz w:val="21"/>
         </w:rPr>
-        <w:t>; resolve those against the immutable release commit. The archive manifest, not this prose, controls which commands are archive-local.</w:t>
+        <w:t xml:space="preserve"> are historical development or provenance references, not sources for the released code. The archive manifest, not this prose, controls which commands are archive-local.</w:t>
       </w:r>
     </w:p>
     <w:p>
@@ -3307,7 +3307,7 @@
           <w:color w:val="1F252B"/>
           <w:sz w:val="21"/>
         </w:rPr>
-        <w:t xml:space="preserve"> output, and critique lane reside in Git at the pinned release commit.</w:t>
+        <w:t xml:space="preserve"> output, and critique lane remain in the historical Git record at the originating commit; they are not part of the canonical capsule-executable surface.</w:t>
       </w:r>
     </w:p>
     <w:p>
@@ -3431,7 +3431,7 @@
           <w:color w:val="1F252B"/>
           <w:sz w:val="18"/>
         </w:rPr>
-        <w:t xml:space="preserve">      -&gt; executable validator -&gt; status/claim ceiling -&gt; immutable Git identity</w:t>
+        <w:t xml:space="preserve">      -&gt; executable validator -&gt; status/claim ceiling -&gt; capsule integrity record</w:t>
       </w:r>
     </w:p>
     <w:p>
@@ -5287,7 +5287,7 @@
                 <w:color w:val="1F252B"/>
                 <w:sz w:val="16"/>
               </w:rPr>
-              <w:t xml:space="preserve"> (Git-only) and </w:t>
+              <w:t xml:space="preserve"> (historical Git reference) and </w:t>
             </w:r>
             <w:r>
               <w:rPr>
@@ -5764,7 +5764,7 @@
                 <w:color w:val="1F252B"/>
                 <w:sz w:val="16"/>
               </w:rPr>
-              <w:t xml:space="preserve">, </w:t>
+              <w:t xml:space="preserve">, historical </w:t>
             </w:r>
             <w:r>
               <w:rPr>
@@ -5785,7 +5785,7 @@
                 <w:color w:val="1F252B"/>
                 <w:sz w:val="16"/>
               </w:rPr>
-              <w:t xml:space="preserve"> (Git-only), and the T-47 width/staircase packets</w:t>
+              <w:t>, and the T-47 width/staircase packets</w:t>
             </w:r>
           </w:p>
         </w:tc>
@@ -5808,6 +5808,16 @@
             </w:pPr>
             <w:r>
               <w:rPr>
+                <w:rFonts w:ascii="Aptos" w:hAnsi="Aptos" w:eastAsia="Aptos"/>
+                <w:b w:val="0"/>
+                <w:i w:val="0"/>
+                <w:color w:val="1F252B"/>
+                <w:sz w:val="16"/>
+              </w:rPr>
+              <w:t xml:space="preserve">Historical </w:t>
+            </w:r>
+            <w:r>
+              <w:rPr>
                 <w:rFonts w:ascii="Aptos Mono" w:hAnsi="Aptos Mono" w:eastAsia="Aptos Mono"/>
                 <w:b w:val="0"/>
                 <w:i w:val="0"/>
@@ -5825,7 +5835,7 @@
                 <w:color w:val="1F252B"/>
                 <w:sz w:val="16"/>
               </w:rPr>
-              <w:t xml:space="preserve"> (Git-only), T-47 independent verifiers, and direct time-evolution/eigendecomposition checks</w:t>
+              <w:t>, T-47 independent verifiers, and direct time-evolution/eigendecomposition checks</w:t>
             </w:r>
           </w:p>
         </w:tc>
@@ -6444,7 +6454,7 @@
                 <w:color w:val="1F252B"/>
                 <w:sz w:val="16"/>
               </w:rPr>
-              <w:t xml:space="preserve"> and the current </w:t>
+              <w:t xml:space="preserve"> and the historical </w:t>
             </w:r>
             <w:r>
               <w:rPr>
@@ -6465,7 +6475,7 @@
                 <w:color w:val="1F252B"/>
                 <w:sz w:val="16"/>
               </w:rPr>
-              <w:t xml:space="preserve"> check (Git-only)</w:t>
+              <w:t xml:space="preserve"> check</w:t>
             </w:r>
           </w:p>
         </w:tc>
@@ -8024,7 +8034,7 @@
           <w:color w:val="1F252B"/>
           <w:sz w:val="21"/>
         </w:rPr>
-        <w:t xml:space="preserve"> adopted RGRL and WTC-H1 through WTC-H5. AURFT/U-DCL supplies upstream program context. The internal hostile/self-consistency review accepted the composition's dependency, normalization, type, and scope. The executable URM surface is </w:t>
+        <w:t xml:space="preserve"> adopted RGRL and WTC-H1 through WTC-H5. AURFT/U-DCL supplies upstream program context. The internal hostile/self-consistency review accepted the composition's dependency, normalization, type, and scope. The historical URM surface is </w:t>
       </w:r>
       <w:r>
         <w:rPr>
@@ -8045,7 +8055,7 @@
           <w:color w:val="1F252B"/>
           <w:sz w:val="21"/>
         </w:rPr>
-        <w:t xml:space="preserve"> (Git-only), checked by </w:t>
+        <w:t xml:space="preserve">, checked by </w:t>
       </w:r>
       <w:r>
         <w:rPr>
@@ -8066,7 +8076,7 @@
           <w:color w:val="1F252B"/>
           <w:sz w:val="21"/>
         </w:rPr>
-        <w:t xml:space="preserve"> (Git-only).</w:t>
+        <w:t>; these paths are not part of the canonical capsule-executable surface.</w:t>
       </w:r>
     </w:p>
     <w:p>
@@ -9356,7 +9366,7 @@
           <w:color w:val="1F252B"/>
           <w:sz w:val="21"/>
         </w:rPr>
-        <w:t xml:space="preserve">The repository-exact relational dependency closure contains 68 files and </w:t>
+        <w:t xml:space="preserve">The authenticated relational dependency closure contains 68 files and </w:t>
       </w:r>
       <w:r>
         <w:rPr>
@@ -9419,7 +9429,7 @@
           <w:color w:val="1F252B"/>
           <w:sz w:val="21"/>
         </w:rPr>
-        <w:t xml:space="preserve">. The Alpha URM integration validator passes </w:t>
+        <w:t xml:space="preserve">. The historical Alpha URM integration run passed </w:t>
       </w:r>
       <w:r>
         <w:rPr>
@@ -9440,7 +9450,7 @@
           <w:color w:val="1F252B"/>
           <w:sz w:val="21"/>
         </w:rPr>
-        <w:t xml:space="preserve"> in Git. Its complete aggregate-runner dependency resides in Git. The archive runs the portable alpha scope gate and self-contained algebraic witness. The release authenticates the specific finite evidence required by the ARGER Gate.</w:t>
+        <w:t>. Its complete aggregate-runner dependency is retained only in the development history and is not part of the canonical released executable surface. The archive runs the portable alpha scope gate and self-contained algebraic witness. The release authenticates the specific finite evidence required by the ARGER Gate.</w:t>
       </w:r>
     </w:p>
     <w:p>
@@ -9867,7 +9877,7 @@
           <w:color w:val="1F252B"/>
           <w:sz w:val="21"/>
         </w:rPr>
-        <w:t xml:space="preserve">. The canonical theorem and later scope repair are linked in the catalogue above. The zero-input URM surface </w:t>
+        <w:t xml:space="preserve">. The canonical theorem and later scope repair are linked in the catalogue above. The historical zero-input URM surface </w:t>
       </w:r>
       <w:r>
         <w:rPr>
@@ -9888,7 +9898,7 @@
           <w:color w:val="1F252B"/>
           <w:sz w:val="21"/>
         </w:rPr>
-        <w:t xml:space="preserve"> (Git-only) authenticates seven governing theorem, audit, and witness artifacts and exposes the fixed interval and quantifiers. Its strict validator </w:t>
+        <w:t xml:space="preserve"> authenticates seven governing theorem, audit, and witness artifacts and exposes the fixed interval and quantifiers. Its strict validator </w:t>
       </w:r>
       <w:r>
         <w:rPr>
@@ -9909,7 +9919,7 @@
           <w:color w:val="1F252B"/>
           <w:sz w:val="21"/>
         </w:rPr>
-        <w:t xml:space="preserve"> (Git-only) passes </w:t>
+        <w:t xml:space="preserve"> passes </w:t>
       </w:r>
       <w:r>
         <w:rPr>
@@ -11881,42 +11891,6 @@
           <w:color w:val="1F252B"/>
           <w:sz w:val="21"/>
         </w:rPr>
-        <w:t xml:space="preserve">From the source repository root, run the same script at </w:t>
-      </w:r>
-      <w:r>
-        <w:rPr>
-          <w:rFonts w:ascii="Aptos Mono" w:hAnsi="Aptos Mono" w:eastAsia="Aptos Mono"/>
-          <w:b w:val="0"/>
-          <w:i w:val="0"/>
-          <w:color w:val="1F252B"/>
-          <w:sz w:val="19"/>
-          <w:shd w:fill="F1F3F5"/>
-        </w:rPr>
-        <w:t>DEVELOPMENT_R_L12_LINEAGE_RESOLVED_SUPPORT_V001/extract_lower_bound_progression.py</w:t>
-      </w:r>
-      <w:r>
-        <w:rPr>
-          <w:rFonts w:ascii="Aptos" w:hAnsi="Aptos" w:eastAsia="Aptos"/>
-          <w:b w:val="0"/>
-          <w:i w:val="0"/>
-          <w:color w:val="1F252B"/>
-          <w:sz w:val="21"/>
-        </w:rPr>
-        <w:t>.</w:t>
-      </w:r>
-    </w:p>
-    <w:p>
-      <w:pPr>
-        <w:spacing w:after="110" w:line="274" w:lineRule="auto"/>
-      </w:pPr>
-      <w:r>
-        <w:rPr>
-          <w:rFonts w:ascii="Aptos" w:hAnsi="Aptos" w:eastAsia="Aptos"/>
-          <w:b w:val="0"/>
-          <w:i w:val="0"/>
-          <w:color w:val="1F252B"/>
-          <w:sz w:val="21"/>
-        </w:rPr>
         <w:t>Expected output:</w:t>
       </w:r>
     </w:p>
@@ -12082,7 +12056,7 @@
           <w:color w:val="1F252B"/>
           <w:sz w:val="21"/>
         </w:rPr>
-        <w:t xml:space="preserve"> reconstruction set contains 86 files and 13,485,786,130 bytes (12.559617 GiB). The compact packet preserves the method, result, and cryptographic custody. The full reconstruction executes from the audited repository workspace.</w:t>
+        <w:t xml:space="preserve"> reconstruction set contains 86 files and 13,485,786,130 bytes (12.559617 GiB). The compact packet preserves the method, result, and cryptographic custody. A full reconstruction requires the separately rebuilt audited workspace described by the deposited method; it is outside the compact capsule-executable surface.</w:t>
       </w:r>
     </w:p>
     <w:p>
@@ -13717,7 +13691,7 @@
           <w:color w:val="1F252B"/>
           <w:sz w:val="21"/>
         </w:rPr>
-        <w:t xml:space="preserve">Git contains the complete chronological research record: source code, theorem development, authenticated evidence, audits, corrections, superseded routes, and release history. The public repository is </w:t>
+        <w:t xml:space="preserve">Git contains the complete chronological development history: historical code, theorem development, authenticated evidence, audits, corrections, superseded routes, and release history. It is a provenance reference, not the authoritative source for the released version. The public historical repository is </w:t>
       </w:r>
       <w:hyperlink r:id="rId60" w:history="1">
         <w:r>
@@ -13753,7 +13727,7 @@
           <w:color w:val="1F252B"/>
           <w:sz w:val="21"/>
         </w:rPr>
-        <w:t>Zenodo contains the deterministic proof and reproduction packet for the released claims: controlling theorem and audit documents, bounded evidence, executable validators, manifests, checksums, metadata, and the immutable Git identity that anchors full custody.</w:t>
+        <w:t>Zenodo contains the authoritative, deterministic source for the released code and proof-reproduction packet: controlling theorem and audit documents, bounded evidence, executable validators, manifests, checksums, and metadata. The originating Git identity is recorded only to identify the historical provenance of the curated release.</w:t>
       </w:r>
     </w:p>
     <w:p>
@@ -19032,7 +19006,7 @@
           <w:color w:val="1F252B"/>
           <w:sz w:val="21"/>
         </w:rPr>
-        <w:t>exact release commit and immutable tag;</w:t>
+        <w:t>originating Git commit and tag recorded as historical provenance;</w:t>
       </w:r>
     </w:p>
     <w:p>
@@ -19155,7 +19129,7 @@
           <w:color w:val="1F252B"/>
           <w:sz w:val="21"/>
         </w:rPr>
-        <w:t xml:space="preserve"> means execution is bound to the immutable repository release.</w:t>
+        <w:t xml:space="preserve"> means a historical development or provenance reference outside the canonical released executable surface.</w:t>
       </w:r>
     </w:p>
     <w:tbl>
@@ -19329,7 +19303,7 @@
                 <w:color w:val="1F252B"/>
                 <w:sz w:val="17"/>
               </w:rPr>
-              <w:t>Capsule documentary / Git-only validation</w:t>
+              <w:t>Capsule documentary / historical validation reference</w:t>
             </w:r>
           </w:p>
         </w:tc>
@@ -19358,7 +19332,7 @@
                 <w:color w:val="1F252B"/>
                 <w:sz w:val="17"/>
               </w:rPr>
-              <w:t>The archive carries the master theorem in Markdown and Word plus its typed component map. The focused certificate validator is bound to the immutable repository release; component execution follows each row below.</w:t>
+              <w:t>The archive carries the master theorem in Markdown and Word plus its typed component map. The historical aggregate certificate validator is not part of the released executable surface; component execution follows each row below.</w:t>
             </w:r>
           </w:p>
         </w:tc>
@@ -19513,7 +19487,7 @@
                 <w:color w:val="1F252B"/>
                 <w:sz w:val="17"/>
               </w:rPr>
-              <w:t>Capsule documentary / Git-only execution</w:t>
+              <w:t>Capsule documentary / historical execution record</w:t>
             </w:r>
           </w:p>
         </w:tc>
@@ -19542,7 +19516,7 @@
                 <w:color w:val="1F252B"/>
                 <w:sz w:val="17"/>
               </w:rPr>
-              <w:t>The proof statements and status are included; the full count-law dependency stack remains Git-bound.</w:t>
+              <w:t>The proof statements and status are included; the omitted count-law dependency stack is retained only in the development history.</w:t>
             </w:r>
           </w:p>
         </w:tc>
@@ -19676,7 +19650,7 @@
                 <w:color w:val="1F252B"/>
                 <w:sz w:val="17"/>
               </w:rPr>
-              <w:t>Scope-repair and algebraic witnesses are capsule executable; the wider theorem family is documentary or Git-only.</w:t>
+              <w:t>Scope-repair and algebraic witnesses are capsule executable; the wider theorem family is documentary or retained only in the development history.</w:t>
             </w:r>
           </w:p>
         </w:tc>
@@ -19852,7 +19826,7 @@
                 <w:color w:val="1F252B"/>
                 <w:sz w:val="17"/>
               </w:rPr>
-              <w:t>Capsule documentary / Git-only execution</w:t>
+              <w:t>Capsule documentary / historical execution record</w:t>
             </w:r>
           </w:p>
         </w:tc>
@@ -19881,7 +19855,7 @@
                 <w:color w:val="1F252B"/>
                 <w:sz w:val="17"/>
               </w:rPr>
-              <w:t>Governing theorem and its internal hostile/self-consistency review are included; the broader validator stack remains repository-bound.</w:t>
+              <w:t>Governing theorem and its internal hostile/self-consistency review are included; the broader validator stack is outside the canonical released executable surface.</w:t>
             </w:r>
           </w:p>
         </w:tc>
@@ -20162,7 +20136,7 @@
                 <w:color w:val="1F252B"/>
                 <w:sz w:val="17"/>
               </w:rPr>
-              <w:t>Capsule documentary / Git-only execution</w:t>
+              <w:t>Capsule documentary / historical execution record</w:t>
             </w:r>
           </w:p>
         </w:tc>
@@ -20191,7 +20165,7 @@
                 <w:color w:val="1F252B"/>
                 <w:sz w:val="17"/>
               </w:rPr>
-              <w:t>U-DCL adoption and the conditional AURFT theorem/audit are included. The aggregate verifier remains Git-bound.</w:t>
+              <w:t>U-DCL adoption and the conditional AURFT theorem/audit are included. The omitted aggregate verifier is retained only in the development history.</w:t>
             </w:r>
           </w:p>
         </w:tc>

</xml_diff>